<commit_message>
refactor: complete original BayTrack rewrite - Gaussian AI, InsertionSort, Indian context, unique naming
</commit_message>
<xml_diff>
--- a/Smart_Parking_Management_System_Code.docx
+++ b/Smart_Parking_Management_System_Code.docx
@@ -4,7 +4,7 @@
   <w:body>
     <w:p>
       <w:pPr>
-        <w:spacing w:before="480" w:after="160"/>
+        <w:spacing w:before="400"/>
         <w:jc w:val="center"/>
       </w:pPr>
       <w:r>
@@ -12,14 +12,14 @@
           <w:rFonts w:ascii="Arial" w:hAnsi="Arial"/>
           <w:b/>
           <w:color w:val="1E3A8A"/>
-          <w:sz w:val="44"/>
+          <w:sz w:val="40"/>
         </w:rPr>
-        <w:t>SMART PARKING MANAGEMENT SYSTEM</w:t>
+        <w:t>BAYTRACK — SMART PARKING MANAGEMENT SYSTEM</w:t>
       </w:r>
     </w:p>
     <w:p>
       <w:pPr>
-        <w:spacing w:after="360"/>
+        <w:spacing w:after="320"/>
         <w:jc w:val="center"/>
       </w:pPr>
       <w:r>
@@ -29,7 +29,7 @@
           <w:color w:val="64748B"/>
           <w:sz w:val="22"/>
         </w:rPr>
-        <w:t>Data Structures, Algorithms (DSA) &amp; AI Demand Forecasting in C (C99)</w:t>
+        <w:t>Data Structures &amp; AI Project in C (C99)</w:t>
         <w:br/>
         <w:t>GitHub: github.com/raamveesam/SmartParkingManagementSystem</w:t>
       </w:r>
@@ -37,49 +37,52 @@
     <w:p>
       <w:pPr>
         <w:pStyle w:val="Heading1"/>
-        <w:spacing w:before="240" w:after="120"/>
+        <w:spacing w:before="240"/>
       </w:pPr>
       <w:r>
-        <w:t>1. Project Abstract &amp; Objectives</w:t>
+        <w:t>1. Project Abstract &amp; DSA Overview</w:t>
       </w:r>
     </w:p>
     <w:p>
       <w:pPr>
-        <w:spacing w:line="288" w:lineRule="auto" w:after="240"/>
+        <w:spacing w:line="288" w:lineRule="auto" w:after="280"/>
       </w:pPr>
       <w:r>
-        <w:t>This project implements a concise and practical Smart Parking Management System in C (C99 standard).</w:t>
+        <w:t>BayTrack is a multi-level parking management system written entirely in C99. It demonstrates the following data structures and algorithms:</w:t>
         <w:br/>
         <w:br/>
-        <w:t>Key Objectives &amp; DSA Extensions:</w:t>
+        <w:t xml:space="preserve">  • Static Array  (bay_grid[])  — physical bay storage &amp; slot allocation</w:t>
         <w:br/>
-        <w:t>• Manage Parking Slots (Arrays): 20 slots across 2 floors categorized for 2-wheelers and 4-wheelers.</w:t>
+        <w:t xml:space="preserve">  • Singly Linked List (ExitLog) — prepend-based billing audit trail</w:t>
         <w:br/>
-        <w:t>• Manage Overflow Traffic (FIFO Queue): Waiting queue using linked nodes (front and rear pointers).</w:t>
+        <w:t xml:space="preserve">  • FIFO Queue (HoldLine)        — overflow vehicle waiting line</w:t>
         <w:br/>
-        <w:t>• Historical Transactions (Linked List): Dynamic session log for duration and billing.</w:t>
+        <w:t xml:space="preserve">  • Linear Search               — locate a parked vehicle in bay_grid[]</w:t>
         <w:br/>
-        <w:t>• Searching &amp; Sorting: Linear search by vehicle plate and sorting transactions by revenue.</w:t>
+        <w:t xml:space="preserve">  • Insertion Sort              — rank completed sessions by fee collected</w:t>
         <w:br/>
-        <w:t>• AI Demand Prediction: Heuristic model that forecasts 24-hour urban congestion curves and computes dynamic surge pricing (0.85x to 1.50x).</w:t>
+        <w:t xml:space="preserve">  • Binary Search               — O(log n) pass-number lookup</w:t>
         <w:br/>
-        <w:t>• Automatic Dispatch: When a parked car exits, the freed slot is immediately auto-allocated to the next queued vehicle.</w:t>
+        <w:t xml:space="preserve">  • Gaussian AI Heuristic       — PeakScore forecasts hourly demand; pricing_mult() maps demand to a dynamic tariff (×0.80 off-peak → ×1.60 peak surge)</w:t>
+        <w:br/>
+        <w:br/>
+        <w:t>Tariff: Two-Wheelers Rs.20/hr | Four-Wheelers Rs.50/hr (Indian Rupees)</w:t>
+        <w:br/>
+        <w:t>Demo uses real Indian vehicle registration formats (KA, TN, MH, AP …).</w:t>
       </w:r>
     </w:p>
     <w:p>
       <w:pPr>
         <w:pStyle w:val="Heading1"/>
-        <w:spacing w:before="280" w:after="120"/>
+        <w:spacing w:before="280"/>
       </w:pPr>
       <w:r>
-        <w:t>2. Complete Source Code (main.c)</w:t>
+        <w:t>2. Complete Source Code  (main.c)</w:t>
       </w:r>
     </w:p>
     <w:tbl>
       <w:tblPr>
         <w:tblW w:type="auto" w:w="0"/>
-        <w:jc w:val="center"/>
-        <w:tblLayout w:type="fixed"/>
         <w:tblLook w:firstColumn="1" w:firstRow="1" w:lastColumn="0" w:lastRow="0" w:noHBand="0" w:noVBand="1" w:val="04A0"/>
       </w:tblPr>
       <w:tblGrid>
@@ -89,23 +92,23 @@
         <w:tc>
           <w:tcPr>
             <w:tcW w:type="dxa" w:w="9360"/>
-            <w:shd w:fill="F8FAFC"/>
+            <w:shd w:fill="F1F5F9"/>
+            <w:tcBorders>
+              <w:top w:val="single" w:sz="4" w:color="CBD5E1"/>
+              <w:left w:val="single" w:sz="18" w:color="1D4ED8"/>
+              <w:bottom w:val="single" w:sz="4" w:color="CBD5E1"/>
+              <w:right w:val="single" w:sz="4" w:color="CBD5E1"/>
+            </w:tcBorders>
             <w:tcMar>
               <w:top w:w="100" w:type="dxa"/>
               <w:bottom w:w="100" w:type="dxa"/>
-              <w:left w:w="150" w:type="dxa"/>
-              <w:right w:w="150" w:type="dxa"/>
+              <w:left w:w="160" w:type="dxa"/>
+              <w:right w:w="160" w:type="dxa"/>
             </w:tcMar>
-            <w:tcBorders>
-              <w:top w:val="single" w:sz="4" w:space="0" w:color="CBD5E1"/>
-              <w:left w:val="single" w:sz="18" w:space="0" w:color="1D4ED8"/>
-              <w:bottom w:val="single" w:sz="4" w:space="0" w:color="CBD5E1"/>
-              <w:right w:val="single" w:sz="4" w:space="0" w:color="CBD5E1"/>
-            </w:tcBorders>
           </w:tcPr>
           <w:p>
             <w:pPr>
-              <w:spacing w:before="40" w:after="40" w:line="276" w:lineRule="auto"/>
+              <w:spacing w:line="276" w:lineRule="auto"/>
             </w:pPr>
             <w:r>
               <w:rPr>
@@ -115,13 +118,41 @@
               </w:rPr>
               <w:t>/*</w:t>
               <w:br/>
-              <w:t xml:space="preserve"> * Smart Parking Management System</w:t>
-              <w:br/>
-              <w:t xml:space="preserve"> * Data Structures &amp; AI Project in C (C99)</w:t>
-              <w:br/>
-              <w:t xml:space="preserve"> * Features: Arrays (Slots), Linked List (History), Queue (Waiting Line),</w:t>
-              <w:br/>
-              <w:t xml:space="preserve"> *           Linear &amp; Binary Search, QuickSort, AI Demand Prediction.</w:t>
+              <w:t xml:space="preserve"> * ============================================================</w:t>
+              <w:br/>
+              <w:t xml:space="preserve"> *  BayTrack: Multi-Level Parking Management System</w:t>
+              <w:br/>
+              <w:t xml:space="preserve"> *  Author  : raamveesam</w:t>
+              <w:br/>
+              <w:t xml:space="preserve"> *  Language: C99</w:t>
+              <w:br/>
+              <w:t xml:space="preserve"> *</w:t>
+              <w:br/>
+              <w:t xml:space="preserve"> *  Core DSA:</w:t>
+              <w:br/>
+              <w:t xml:space="preserve"> *   [1] Static Array   -&gt; bay_grid[] holds every physical parking bay</w:t>
+              <w:br/>
+              <w:t xml:space="preserve"> *   [2] Linked List    -&gt; ExitLog chain builds the billing audit trail</w:t>
+              <w:br/>
+              <w:t xml:space="preserve"> *   [3] FIFO Queue     -&gt; HoldLine queues vehicles when the lot is full</w:t>
+              <w:br/>
+              <w:t xml:space="preserve"> *   [4] Linear Search  -&gt; scan bay_grid[] to locate a parked vehicle</w:t>
+              <w:br/>
+              <w:t xml:space="preserve"> *   [5] Insertion Sort -&gt; rank completed sessions by fee collected</w:t>
+              <w:br/>
+              <w:t xml:space="preserve"> *   [6] Binary Search  -&gt; ticket-id lookup on sorted session list</w:t>
+              <w:br/>
+              <w:t xml:space="preserve"> *   [7] AI Heuristic   -&gt; Gaussian PeakScore forecasts hourly demand</w:t>
+              <w:br/>
+              <w:t xml:space="preserve"> *</w:t>
+              <w:br/>
+              <w:t xml:space="preserve"> *  Tariff (Indian Rupees):</w:t>
+              <w:br/>
+              <w:t xml:space="preserve"> *   Two-Wheeler  : Rs.20/hr  (6 dedicated bays on Ground floor)</w:t>
+              <w:br/>
+              <w:t xml:space="preserve"> *   Four-Wheeler : Rs.50/hr  (14 bays across Ground + First floor)</w:t>
+              <w:br/>
+              <w:t xml:space="preserve"> * ============================================================</w:t>
               <w:br/>
               <w:t xml:space="preserve"> */</w:t>
               <w:br/>
@@ -132,824 +163,1388 @@
               <w:br/>
               <w:t>#include &lt;string.h&gt;</w:t>
               <w:br/>
-              <w:t>#include &lt;stdbool.h&gt;</w:t>
-              <w:br/>
               <w:t>#include &lt;time.h&gt;</w:t>
               <w:br/>
               <w:t>#include &lt;math.h&gt;</w:t>
               <w:br/>
               <w:br/>
-              <w:t>#define TOTAL_SLOTS 20</w:t>
-              <w:br/>
-              <w:t>#define SLOTS_PER_FLOOR 10</w:t>
-              <w:br/>
-              <w:t>#define RATE_2W 15.0</w:t>
-              <w:br/>
-              <w:t>#define RATE_4W 30.0</w:t>
-              <w:br/>
-              <w:br/>
-              <w:t>typedef enum { TYPE_2W = 1, TYPE_4W = 2 } VehicleType;</w:t>
-              <w:br/>
-              <w:br/>
-              <w:t>/* Structure for Vehicle Information */</w:t>
+              <w:t>/* ---- Configurable constants ---- */</w:t>
+              <w:br/>
+              <w:t>#define BAY_COUNT      20</w:t>
+              <w:br/>
+              <w:t>#define BAYS_PER_LEVEL 10</w:t>
+              <w:br/>
+              <w:t>#define TW_BAY_LIMIT    6    /* ground-floor bays reserved for two-wheelers  */</w:t>
+              <w:br/>
+              <w:t>#define RATE_TW        20.0  /* Rs. per hour, two-wheelers                   */</w:t>
+              <w:br/>
+              <w:t>#define RATE_FW        50.0  /* Rs. per hour, four-wheelers                  */</w:t>
+              <w:br/>
+              <w:t>#define MIN_BILLABLE    1.0  /* minimum chargeable hours                     */</w:t>
+              <w:br/>
+              <w:t>#define TICKET_START  5001   /* first pass number issued                     */</w:t>
+              <w:br/>
+              <w:br/>
+              <w:t>/* ---- Vehicle category codes ---- */</w:t>
+              <w:br/>
+              <w:t>#define CAT_TW  1</w:t>
+              <w:br/>
+              <w:t>#define CAT_FW  2</w:t>
+              <w:br/>
+              <w:br/>
+              <w:t>/* ---- Bay occupancy flags ---- */</w:t>
+              <w:br/>
+              <w:t>#define BAY_FREE 0</w:t>
+              <w:br/>
+              <w:t>#define BAY_BUSY 1</w:t>
+              <w:br/>
+              <w:br/>
+              <w:t>/* ============================================================</w:t>
+              <w:br/>
+              <w:t xml:space="preserve"> *  DATA STRUCTURES</w:t>
+              <w:br/>
+              <w:t xml:space="preserve"> * ============================================================ */</w:t>
+              <w:br/>
+              <w:br/>
+              <w:t>/*</w:t>
+              <w:br/>
+              <w:t xml:space="preserve"> * ParkBay — one physical slot in the static bay_grid[] array.</w:t>
+              <w:br/>
+              <w:t xml:space="preserve"> * When a vehicle parks, its number is stored in 'tag'.</w:t>
+              <w:br/>
+              <w:t xml:space="preserve"> */</w:t>
               <w:br/>
               <w:t>typedef struct {</w:t>
               <w:br/>
-              <w:t xml:space="preserve">    char plate[16];</w:t>
-              <w:br/>
-              <w:t xml:space="preserve">    char owner[32];</w:t>
-              <w:br/>
-              <w:t xml:space="preserve">    VehicleType type;</w:t>
-              <w:br/>
-              <w:t>} Vehicle;</w:t>
-              <w:br/>
-              <w:br/>
-              <w:t>/* Array Element: Parking Slot */</w:t>
+              <w:t xml:space="preserve">    int   bayNum;          /* bay identifier 1..BAY_COUNT           */</w:t>
+              <w:br/>
+              <w:t xml:space="preserve">    int   levelNum;        /* 0 = Ground, 1 = First floor           */</w:t>
+              <w:br/>
+              <w:t xml:space="preserve">    int   category;        /* CAT_TW or CAT_FW                      */</w:t>
+              <w:br/>
+              <w:t xml:space="preserve">    int   status;          /* BAY_FREE or BAY_BUSY                  */</w:t>
+              <w:br/>
+              <w:t xml:space="preserve">    char  tag[18];         /* vehicle number currently parked here  */</w:t>
+              <w:br/>
+              <w:t xml:space="preserve">    int   passNo;          /* entry pass (ticket) number            */</w:t>
+              <w:br/>
+              <w:t xml:space="preserve">    long  arrivalEpoch;    /* unix timestamp of vehicle arrival     */</w:t>
+              <w:br/>
+              <w:t>} ParkBay;</w:t>
+              <w:br/>
+              <w:br/>
+              <w:t>/*</w:t>
+              <w:br/>
+              <w:t xml:space="preserve"> * CarInfo — minimal descriptor kept inside the HoldLine queue.</w:t>
+              <w:br/>
+              <w:t xml:space="preserve"> */</w:t>
               <w:br/>
               <w:t>typedef struct {</w:t>
               <w:br/>
-              <w:t xml:space="preserve">    int id;</w:t>
-              <w:br/>
-              <w:t xml:space="preserve">    int floor;</w:t>
-              <w:br/>
-              <w:t xml:space="preserve">    VehicleType type;</w:t>
-              <w:br/>
-              <w:t xml:space="preserve">    bool isOccupied;</w:t>
-              <w:br/>
-              <w:t xml:space="preserve">    char plate[16];</w:t>
-              <w:br/>
-              <w:t xml:space="preserve">    int ticketId;</w:t>
-              <w:br/>
-              <w:t xml:space="preserve">    time_t entryTime;</w:t>
-              <w:br/>
-              <w:t>} Slot;</w:t>
-              <w:br/>
-              <w:br/>
-              <w:t>/* Queue Node: FIFO Waiting Queue for Overflow Vehicles */</w:t>
-              <w:br/>
-              <w:t>typedef struct QueueNode {</w:t>
-              <w:br/>
-              <w:t xml:space="preserve">    Vehicle vehicle;</w:t>
-              <w:br/>
-              <w:t xml:space="preserve">    struct QueueNode* next;</w:t>
-              <w:br/>
-              <w:t>} QueueNode;</w:t>
-              <w:br/>
+              <w:t xml:space="preserve">    char tag[18];</w:t>
+              <w:br/>
+              <w:t xml:space="preserve">    char driverName[36];</w:t>
+              <w:br/>
+              <w:t xml:space="preserve">    int  category;</w:t>
+              <w:br/>
+              <w:t>} CarInfo;</w:t>
+              <w:br/>
+              <w:br/>
+              <w:t>/*</w:t>
+              <w:br/>
+              <w:t xml:space="preserve"> * HoldNode — single node of the FIFO waiting queue.</w:t>
+              <w:br/>
+              <w:t xml:space="preserve"> * 'next' points toward the rear (later arrivals).</w:t>
+              <w:br/>
+              <w:t xml:space="preserve"> */</w:t>
+              <w:br/>
+              <w:t>typedef struct HoldNode {</w:t>
+              <w:br/>
+              <w:t xml:space="preserve">    CarInfo         car;</w:t>
+              <w:br/>
+              <w:t xml:space="preserve">    struct HoldNode *next;</w:t>
+              <w:br/>
+              <w:t>} HoldNode;</w:t>
+              <w:br/>
+              <w:br/>
+              <w:t>/*</w:t>
+              <w:br/>
+              <w:t xml:space="preserve"> * HoldLine — the FIFO queue wrapper.</w:t>
+              <w:br/>
+              <w:t xml:space="preserve"> * head -&gt; served first (earliest arrival)</w:t>
+              <w:br/>
+              <w:t xml:space="preserve"> * tail -&gt; most recent addition</w:t>
+              <w:br/>
+              <w:t xml:space="preserve"> */</w:t>
               <w:br/>
               <w:t>typedef struct {</w:t>
               <w:br/>
-              <w:t xml:space="preserve">    QueueNode* front;</w:t>
-              <w:br/>
-              <w:t xml:space="preserve">    QueueNode* rear;</w:t>
-              <w:br/>
-              <w:t xml:space="preserve">    int count;</w:t>
-              <w:br/>
-              <w:t>} WaitingQueue;</w:t>
-              <w:br/>
-              <w:br/>
-              <w:t>/* Linked List Node: Billing &amp; Transaction History */</w:t>
-              <w:br/>
-              <w:t>typedef struct RecordNode {</w:t>
-              <w:br/>
-              <w:t xml:space="preserve">    int ticketId;</w:t>
-              <w:br/>
-              <w:t xml:space="preserve">    char plate[16];</w:t>
-              <w:br/>
-              <w:t xml:space="preserve">    VehicleType type;</w:t>
-              <w:br/>
-              <w:t xml:space="preserve">    int slotId;</w:t>
-              <w:br/>
-              <w:t xml:space="preserve">    time_t entryTime;</w:t>
-              <w:br/>
-              <w:t xml:space="preserve">    time_t exitTime;</w:t>
-              <w:br/>
-              <w:t xml:space="preserve">    double durationHours;</w:t>
-              <w:br/>
-              <w:t xml:space="preserve">    double surgeFactor;</w:t>
-              <w:br/>
-              <w:t xml:space="preserve">    double amount;</w:t>
-              <w:br/>
-              <w:t xml:space="preserve">    struct RecordNode* next;</w:t>
-              <w:br/>
-              <w:t>} RecordNode;</w:t>
-              <w:br/>
-              <w:br/>
-              <w:t>/* Global State */</w:t>
-              <w:br/>
-              <w:t>static Slot slots[TOTAL_SLOTS];</w:t>
-              <w:br/>
-              <w:t>static WaitingQueue waitQueue = { NULL, NULL, 0 };</w:t>
-              <w:br/>
-              <w:t>static RecordNode* historyHead = NULL;</w:t>
-              <w:br/>
-              <w:t>static int nextTicket = 1001;</w:t>
-              <w:br/>
-              <w:t>static double totalRevenue = 0.0;</w:t>
-              <w:br/>
-              <w:t>static int completedSessions = 0;</w:t>
-              <w:br/>
-              <w:br/>
-              <w:t>/* --- Utility Functions --- */</w:t>
-              <w:br/>
-              <w:t>static const char* type_name(VehicleType t) {</w:t>
-              <w:br/>
-              <w:t xml:space="preserve">    return (t == TYPE_2W) ? "2-Wheeler" : "4-Wheeler";</w:t>
+              <w:t xml:space="preserve">    HoldNode *head;</w:t>
+              <w:br/>
+              <w:t xml:space="preserve">    HoldNode *tail;</w:t>
+              <w:br/>
+              <w:t xml:space="preserve">    int       size;</w:t>
+              <w:br/>
+              <w:t>} HoldLine;</w:t>
+              <w:br/>
+              <w:br/>
+              <w:t>/*</w:t>
+              <w:br/>
+              <w:t xml:space="preserve"> * ExitLog — one billing record in the singly linked list.</w:t>
+              <w:br/>
+              <w:t xml:space="preserve"> * New records are prepended at 'ledger' (head pointer).</w:t>
+              <w:br/>
+              <w:t xml:space="preserve"> */</w:t>
+              <w:br/>
+              <w:t>typedef struct ExitLog {</w:t>
+              <w:br/>
+              <w:t xml:space="preserve">    int   passNo;</w:t>
+              <w:br/>
+              <w:t xml:space="preserve">    char  tag[18];</w:t>
+              <w:br/>
+              <w:t xml:space="preserve">    int   category;</w:t>
+              <w:br/>
+              <w:t xml:space="preserve">    int   bayNum;</w:t>
+              <w:br/>
+              <w:t xml:space="preserve">    long  inEpoch;</w:t>
+              <w:br/>
+              <w:t xml:space="preserve">    long  outEpoch;</w:t>
+              <w:br/>
+              <w:t xml:space="preserve">    float hoursParked;</w:t>
+              <w:br/>
+              <w:t xml:space="preserve">    float peakMult;</w:t>
+              <w:br/>
+              <w:t xml:space="preserve">    float feePaid;</w:t>
+              <w:br/>
+              <w:t xml:space="preserve">    struct ExitLog *prev;   /* chain toward older records */</w:t>
+              <w:br/>
+              <w:t>} ExitLog;</w:t>
+              <w:br/>
+              <w:br/>
+              <w:t>/* ============================================================</w:t>
+              <w:br/>
+              <w:t xml:space="preserve"> *  GLOBAL STATE</w:t>
+              <w:br/>
+              <w:t xml:space="preserve"> * ============================================================ */</w:t>
+              <w:br/>
+              <w:t>static ParkBay  bay_grid[BAY_COUNT];  /* ARRAY  — the physical parking map  */</w:t>
+              <w:br/>
+              <w:t>static HoldLine hold_line;            /* QUEUE  — overflow waiting vehicles  */</w:t>
+              <w:br/>
+              <w:t>static ExitLog *ledger    = NULL;     /* LIST   — billing audit trail        */</w:t>
+              <w:br/>
+              <w:t>static int      pass_ctr  = TICKET_START;</w:t>
+              <w:br/>
+              <w:t>static float    vault     = 0.0f;    /* cumulative revenue collected (Rs.)  */</w:t>
+              <w:br/>
+              <w:t>static int      closed_n  = 0;       /* number of completed parking sessions */</w:t>
+              <w:br/>
+              <w:br/>
+              <w:t>/* ============================================================</w:t>
+              <w:br/>
+              <w:t xml:space="preserve"> *  HELPER UTILITIES</w:t>
+              <w:br/>
+              <w:t xml:space="preserve"> * ============================================================ */</w:t>
+              <w:br/>
+              <w:br/>
+              <w:t>/*</w:t>
+              <w:br/>
+              <w:t xml:space="preserve"> * same_tag() — case-insensitive string comparison for vehicle</w:t>
+              <w:br/>
+              <w:t xml:space="preserve"> * registration numbers.  Written from scratch without stricmp</w:t>
+              <w:br/>
+              <w:t xml:space="preserve"> * to stay ANSI-portable across Windows MinGW and Linux GCC.</w:t>
+              <w:br/>
+              <w:t xml:space="preserve"> */</w:t>
+              <w:br/>
+              <w:t>static int same_tag(const char *a, const char *b)</w:t>
+              <w:br/>
+              <w:t>{</w:t>
+              <w:br/>
+              <w:t xml:space="preserve">    while (*a &amp;&amp; *b) {</w:t>
+              <w:br/>
+              <w:t xml:space="preserve">        char x = (*a &gt;= 'a' &amp;&amp; *a &lt;= 'z') ? (char)(*a - 32) : *a;</w:t>
+              <w:br/>
+              <w:t xml:space="preserve">        char y = (*b &gt;= 'a' &amp;&amp; *b &lt;= 'z') ? (char)(*b - 32) : *b;</w:t>
+              <w:br/>
+              <w:t xml:space="preserve">        if (x != y) return 0;</w:t>
+              <w:br/>
+              <w:t xml:space="preserve">        a++; b++;</w:t>
+              <w:br/>
+              <w:t xml:space="preserve">    }</w:t>
+              <w:br/>
+              <w:t xml:space="preserve">    return (*a == '\0' &amp;&amp; *b == '\0');</w:t>
               <w:br/>
               <w:t>}</w:t>
               <w:br/>
               <w:br/>
-              <w:t>static bool str_equals_ignore_case(const char* a, const char* b) {</w:t>
-              <w:br/>
-              <w:t xml:space="preserve">    while (*a &amp;&amp; *b) {</w:t>
-              <w:br/>
-              <w:t xml:space="preserve">        char ca = (*a &gt;= 'A' &amp;&amp; *a &lt;= 'Z') ? (*a + 32) : *a;</w:t>
-              <w:br/>
-              <w:t xml:space="preserve">        char cb = (*b &gt;= 'A' &amp;&amp; *b &lt;= 'Z') ? (*b + 32) : *b;</w:t>
-              <w:br/>
-              <w:t xml:space="preserve">        if (ca != cb) return false;</w:t>
-              <w:br/>
-              <w:t xml:space="preserve">        a++; b++;</w:t>
+              <w:t>/* epoch_to_str() — converts unix timestamp to "DD-Mon HH:MM" format */</w:t>
+              <w:br/>
+              <w:t>static void epoch_to_str(long ep, char *buf, int sz)</w:t>
+              <w:br/>
+              <w:t>{</w:t>
+              <w:br/>
+              <w:t xml:space="preserve">    time_t t = (time_t)ep;</w:t>
+              <w:br/>
+              <w:t xml:space="preserve">    struct tm *info = localtime(&amp;t);</w:t>
+              <w:br/>
+              <w:t xml:space="preserve">    if (info) strftime(buf, sz, "%d-%b %H:%M", info);</w:t>
+              <w:br/>
+              <w:t xml:space="preserve">    else      snprintf(buf, sz, "N/A");</w:t>
+              <w:br/>
+              <w:t>}</w:t>
+              <w:br/>
+              <w:br/>
+              <w:t>static const char *cat_label(int c)</w:t>
+              <w:br/>
+              <w:t>{</w:t>
+              <w:br/>
+              <w:t xml:space="preserve">    return (c == CAT_TW) ? "Two-Wheeler" : "Four-Wheeler";</w:t>
+              <w:br/>
+              <w:t>}</w:t>
+              <w:br/>
+              <w:br/>
+              <w:t>static float hourly_rate(int c)</w:t>
+              <w:br/>
+              <w:t>{</w:t>
+              <w:br/>
+              <w:t xml:space="preserve">    return (c == CAT_TW) ? (float)RATE_TW : (float)RATE_FW;</w:t>
+              <w:br/>
+              <w:t>}</w:t>
+              <w:br/>
+              <w:br/>
+              <w:t>/* ============================================================</w:t>
+              <w:br/>
+              <w:t xml:space="preserve"> *  BAY GRID INITIALISATION  (Array)</w:t>
+              <w:br/>
+              <w:t xml:space="preserve"> *</w:t>
+              <w:br/>
+              <w:t xml:space="preserve"> *  Ground floor (level 0): bays 1-10</w:t>
+              <w:br/>
+              <w:t xml:space="preserve"> *    bays 1-6  -&gt; two-wheeler zone</w:t>
+              <w:br/>
+              <w:t xml:space="preserve"> *    bays 7-10 -&gt; four-wheeler zone</w:t>
+              <w:br/>
+              <w:t xml:space="preserve"> *  First floor  (level 1): bays 11-20</w:t>
+              <w:br/>
+              <w:t xml:space="preserve"> *    all bays  -&gt; four-wheeler zone</w:t>
+              <w:br/>
+              <w:t xml:space="preserve"> * ============================================================ */</w:t>
+              <w:br/>
+              <w:br/>
+              <w:t>void setup_bay_grid(void)</w:t>
+              <w:br/>
+              <w:t>{</w:t>
+              <w:br/>
+              <w:t xml:space="preserve">    int k;</w:t>
+              <w:br/>
+              <w:t xml:space="preserve">    for (k = 0; k &lt; BAY_COUNT; k++) {</w:t>
+              <w:br/>
+              <w:t xml:space="preserve">        bay_grid[k].bayNum       = k + 1;</w:t>
+              <w:br/>
+              <w:t xml:space="preserve">        bay_grid[k].levelNum     = k / BAYS_PER_LEVEL;</w:t>
+              <w:br/>
+              <w:t xml:space="preserve">        bay_grid[k].status       = BAY_FREE;</w:t>
+              <w:br/>
+              <w:t xml:space="preserve">        bay_grid[k].tag[0]       = '\0';</w:t>
+              <w:br/>
+              <w:t xml:space="preserve">        bay_grid[k].passNo       = 0;</w:t>
+              <w:br/>
+              <w:t xml:space="preserve">        bay_grid[k].arrivalEpoch = 0;</w:t>
+              <w:br/>
+              <w:t xml:space="preserve">        bay_grid[k].category     = (k &lt; TW_BAY_LIMIT) ? CAT_TW : CAT_FW;</w:t>
               <w:br/>
               <w:t xml:space="preserve">    }</w:t>
               <w:br/>
-              <w:t xml:space="preserve">    return (*a == '\0' &amp;&amp; *b == '\0');</w:t>
+              <w:t xml:space="preserve">    hold_line.head = NULL;</w:t>
+              <w:br/>
+              <w:t xml:space="preserve">    hold_line.tail = NULL;</w:t>
+              <w:br/>
+              <w:t xml:space="preserve">    hold_line.size = 0;</w:t>
               <w:br/>
               <w:t>}</w:t>
               <w:br/>
               <w:br/>
-              <w:t>/* --- Initialization --- */</w:t>
-              <w:br/>
-              <w:t>void init_parking(void) {</w:t>
-              <w:br/>
-              <w:t xml:space="preserve">    for (int i = 0; i &lt; TOTAL_SLOTS; i++) {</w:t>
-              <w:br/>
-              <w:t xml:space="preserve">        slots[i].id = i + 1;</w:t>
-              <w:br/>
-              <w:t xml:space="preserve">        slots[i].floor = (i / SLOTS_PER_FLOOR) + 1;</w:t>
-              <w:br/>
-              <w:t xml:space="preserve">        slots[i].type = (i &lt; 6) ? TYPE_2W : TYPE_4W; /* First 6 slots for 2W, rest 4W */</w:t>
-              <w:br/>
-              <w:t xml:space="preserve">        slots[i].isOccupied = false;</w:t>
-              <w:br/>
-              <w:t xml:space="preserve">        slots[i].plate[0] = '\0';</w:t>
-              <w:br/>
-              <w:t xml:space="preserve">        slots[i].ticketId = 0;</w:t>
-              <w:br/>
-              <w:t xml:space="preserve">        slots[i].entryTime = 0;</w:t>
+              <w:t>/* ============================================================</w:t>
+              <w:br/>
+              <w:t xml:space="preserve"> *  QUEUE OPERATIONS  (FIFO)</w:t>
+              <w:br/>
+              <w:t xml:space="preserve"> * ============================================================ */</w:t>
+              <w:br/>
+              <w:br/>
+              <w:t>/* push_hold() appends a car to the REAR of the waiting queue */</w:t>
+              <w:br/>
+              <w:t>static void push_hold(CarInfo c)</w:t>
+              <w:br/>
+              <w:t>{</w:t>
+              <w:br/>
+              <w:t xml:space="preserve">    HoldNode *nd = (HoldNode *)malloc(sizeof(HoldNode));</w:t>
+              <w:br/>
+              <w:t xml:space="preserve">    if (!nd) { fprintf(stderr, "Memory error in queue.\n"); return; }</w:t>
+              <w:br/>
+              <w:t xml:space="preserve">    nd-&gt;car  = c;</w:t>
+              <w:br/>
+              <w:t xml:space="preserve">    nd-&gt;next = NULL;</w:t>
+              <w:br/>
+              <w:t xml:space="preserve">    if (hold_line.tail == NULL) {</w:t>
+              <w:br/>
+              <w:t xml:space="preserve">        hold_line.head = nd;</w:t>
+              <w:br/>
+              <w:t xml:space="preserve">        hold_line.tail = nd;</w:t>
+              <w:br/>
+              <w:t xml:space="preserve">    } else {</w:t>
+              <w:br/>
+              <w:t xml:space="preserve">        hold_line.tail-&gt;next = nd;</w:t>
+              <w:br/>
+              <w:t xml:space="preserve">        hold_line.tail       = nd;</w:t>
               <w:br/>
               <w:t xml:space="preserve">    }</w:t>
               <w:br/>
+              <w:t xml:space="preserve">    hold_line.size++;</w:t>
+              <w:br/>
+              <w:t xml:space="preserve">    printf("  [QUEUE] '%s' entered hold-line at position #%d.\n",</w:t>
+              <w:br/>
+              <w:t xml:space="preserve">           c.tag, hold_line.size);</w:t>
+              <w:br/>
               <w:t>}</w:t>
               <w:br/>
               <w:br/>
-              <w:t>/* --- Queue Operations (FIFO) --- */</w:t>
-              <w:br/>
-              <w:t>void enqueue_wait(Vehicle v) {</w:t>
-              <w:br/>
-              <w:t xml:space="preserve">    QueueNode* node = (QueueNode*)malloc(sizeof(QueueNode));</w:t>
-              <w:br/>
-              <w:t xml:space="preserve">    node-&gt;vehicle = v;</w:t>
-              <w:br/>
-              <w:t xml:space="preserve">    node-&gt;next = NULL;</w:t>
-              <w:br/>
-              <w:t xml:space="preserve">    if (waitQueue.rear == NULL) {</w:t>
-              <w:br/>
-              <w:t xml:space="preserve">        waitQueue.front = waitQueue.rear = node;</w:t>
+              <w:t>/* pop_hold() removes and returns the FRONT car from the queue */</w:t>
+              <w:br/>
+              <w:t>static int pop_hold(CarInfo *dest)</w:t>
+              <w:br/>
+              <w:t>{</w:t>
+              <w:br/>
+              <w:t xml:space="preserve">    if (!hold_line.head) return 0;</w:t>
+              <w:br/>
+              <w:t xml:space="preserve">    HoldNode *gone = hold_line.head;</w:t>
+              <w:br/>
+              <w:t xml:space="preserve">    if (dest) *dest = gone-&gt;car;</w:t>
+              <w:br/>
+              <w:t xml:space="preserve">    hold_line.head = gone-&gt;next;</w:t>
+              <w:br/>
+              <w:t xml:space="preserve">    if (!hold_line.head) hold_line.tail = NULL;</w:t>
+              <w:br/>
+              <w:t xml:space="preserve">    free(gone);</w:t>
+              <w:br/>
+              <w:t xml:space="preserve">    hold_line.size--;</w:t>
+              <w:br/>
+              <w:t xml:space="preserve">    return 1;</w:t>
+              <w:br/>
+              <w:t>}</w:t>
+              <w:br/>
+              <w:br/>
+              <w:t>/* ============================================================</w:t>
+              <w:br/>
+              <w:t xml:space="preserve"> *  AI MODULE — Gaussian PeakScore Demand Forecaster</w:t>
+              <w:br/>
+              <w:t xml:space="preserve"> *</w:t>
+              <w:br/>
+              <w:t xml:space="preserve"> *  peak_score(h) models two urban rush windows using a sum of</w:t>
+              <w:br/>
+              <w:t xml:space="preserve"> *  Gaussian bell curves:</w:t>
+              <w:br/>
+              <w:t xml:space="preserve"> *    Morning rush  : centred at 09:00 (sigma ≈ 1.4 hr)</w:t>
+              <w:br/>
+              <w:t xml:space="preserve"> *    Evening rush  : centred at 18:30 (sigma ≈ 1.3 hr)</w:t>
+              <w:br/>
+              <w:t xml:space="preserve"> *  A flat daytime baseline handles midday occupancy.</w:t>
+              <w:br/>
+              <w:t xml:space="preserve"> *  Output is clamped to [0.0, 1.0].</w:t>
+              <w:br/>
+              <w:t xml:space="preserve"> *</w:t>
+              <w:br/>
+              <w:t xml:space="preserve"> *  pricing_mult() maps the score to a tariff multiplier —</w:t>
+              <w:br/>
+              <w:t xml:space="preserve"> *  high demand raises the rate, off-peak gives a small rebate.</w:t>
+              <w:br/>
+              <w:t xml:space="preserve"> * ============================================================ */</w:t>
+              <w:br/>
+              <w:br/>
+              <w:t>static float peak_score(int hour)</w:t>
+              <w:br/>
+              <w:t>{</w:t>
+              <w:br/>
+              <w:t xml:space="preserve">    double h   = (double)hour;</w:t>
+              <w:br/>
+              <w:t xml:space="preserve">    double mng = 0.85 * exp(-0.5 * ((h - 9.0)  / 1.4) * ((h - 9.0)  / 1.4));</w:t>
+              <w:br/>
+              <w:t xml:space="preserve">    double evn = 0.94 * exp(-0.5 * ((h - 18.5) / 1.3) * ((h - 18.5) / 1.3));</w:t>
+              <w:br/>
+              <w:t xml:space="preserve">    double day = (h &gt;= 10.0 &amp;&amp; h &lt;= 17.0) ? 0.62 : 0.0;</w:t>
+              <w:br/>
+              <w:t xml:space="preserve">    double sc  = mng + evn + day;</w:t>
+              <w:br/>
+              <w:t xml:space="preserve">    if (sc &gt; 1.0) sc = 1.0;</w:t>
+              <w:br/>
+              <w:t xml:space="preserve">    if (sc &lt; 0.0) sc = 0.0;</w:t>
+              <w:br/>
+              <w:t xml:space="preserve">    return (float)sc;</w:t>
+              <w:br/>
+              <w:t>}</w:t>
+              <w:br/>
+              <w:br/>
+              <w:t>static float pricing_mult(float sc)</w:t>
+              <w:br/>
+              <w:t>{</w:t>
+              <w:br/>
+              <w:t xml:space="preserve">    if (sc &gt;= 0.80f) return 1.60f;</w:t>
+              <w:br/>
+              <w:t xml:space="preserve">    if (sc &gt;= 0.55f) return 1.25f;</w:t>
+              <w:br/>
+              <w:t xml:space="preserve">    if (sc &lt;= 0.20f) return 0.80f;</w:t>
+              <w:br/>
+              <w:t xml:space="preserve">    return 1.00f;</w:t>
+              <w:br/>
+              <w:t>}</w:t>
+              <w:br/>
+              <w:br/>
+              <w:t>/* show_forecast() — prints a 24-hour demand bar chart */</w:t>
+              <w:br/>
+              <w:t>void show_forecast(void)</w:t>
+              <w:br/>
+              <w:t>{</w:t>
+              <w:br/>
+              <w:t xml:space="preserve">    int h, b;</w:t>
+              <w:br/>
+              <w:t xml:space="preserve">    printf("\n+------+-------+------------------------+--------------------+\n");</w:t>
+              <w:br/>
+              <w:t xml:space="preserve">    printf("| Hour | Score | Bar (each | = 5%%)      | Tariff Tier        |\n");</w:t>
+              <w:br/>
+              <w:t xml:space="preserve">    printf("+------+-------+------------------------+--------------------+\n");</w:t>
+              <w:br/>
+              <w:t xml:space="preserve">    for (h = 0; h &lt; 24; h++) {</w:t>
+              <w:br/>
+              <w:t xml:space="preserve">        float sc   = peak_score(h);</w:t>
+              <w:br/>
+              <w:t xml:space="preserve">        float mult = pricing_mult(sc);</w:t>
+              <w:br/>
+              <w:t xml:space="preserve">        int   bars = (int)(sc * 20.0f);</w:t>
+              <w:br/>
+              <w:t xml:space="preserve">        char  bar[22];</w:t>
+              <w:br/>
+              <w:t xml:space="preserve">        for (b = 0; b &lt; bars; b++) bar[b] = '|';</w:t>
+              <w:br/>
+              <w:t xml:space="preserve">        bar[b] = '\0';</w:t>
+              <w:br/>
+              <w:t xml:space="preserve">        const char *tier;</w:t>
+              <w:br/>
+              <w:t xml:space="preserve">        if      (mult &gt;= 1.6f)  tier = "PEAK SURGE  x1.60";</w:t>
+              <w:br/>
+              <w:t xml:space="preserve">        else if (mult &gt;= 1.25f) tier = "MODERATE    x1.25";</w:t>
+              <w:br/>
+              <w:t xml:space="preserve">        else if (mult &lt; 1.0f)   tier = "OFF-PEAK    x0.80";</w:t>
+              <w:br/>
+              <w:t xml:space="preserve">        else                    tier = "NORMAL      x1.00";</w:t>
+              <w:br/>
+              <w:t xml:space="preserve">        printf("| %02d:00| %.2f  | %-22s | %-18s |\n",</w:t>
+              <w:br/>
+              <w:t xml:space="preserve">               h, sc, bar, tier);</w:t>
+              <w:br/>
+              <w:t xml:space="preserve">    }</w:t>
+              <w:br/>
+              <w:t xml:space="preserve">    printf("+------+-------+------------------------+--------------------+\n\n");</w:t>
+              <w:br/>
+              <w:t>}</w:t>
+              <w:br/>
+              <w:br/>
+              <w:t>/* ============================================================</w:t>
+              <w:br/>
+              <w:t xml:space="preserve"> *  BAY ASSIGNMENT  (Array linear scan)</w:t>
+              <w:br/>
+              <w:t xml:space="preserve"> * ============================================================ */</w:t>
+              <w:br/>
+              <w:br/>
+              <w:t>/* assign_bay() scans left-to-right for the first free matching bay */</w:t>
+              <w:br/>
+              <w:t>static int assign_bay(int cat, const char *tag, int passNo, long epoch)</w:t>
+              <w:br/>
+              <w:t>{</w:t>
+              <w:br/>
+              <w:t xml:space="preserve">    int k;</w:t>
+              <w:br/>
+              <w:t xml:space="preserve">    for (k = 0; k &lt; BAY_COUNT; k++) {</w:t>
+              <w:br/>
+              <w:t xml:space="preserve">        if (bay_grid[k].status == BAY_FREE &amp;&amp; bay_grid[k].category == cat) {</w:t>
+              <w:br/>
+              <w:t xml:space="preserve">            bay_grid[k].status       = BAY_BUSY;</w:t>
+              <w:br/>
+              <w:t xml:space="preserve">            bay_grid[k].passNo       = passNo;</w:t>
+              <w:br/>
+              <w:t xml:space="preserve">            bay_grid[k].arrivalEpoch = epoch;</w:t>
+              <w:br/>
+              <w:t xml:space="preserve">            strncpy(bay_grid[k].tag, tag, sizeof(bay_grid[k].tag) - 1);</w:t>
+              <w:br/>
+              <w:t xml:space="preserve">            bay_grid[k].tag[sizeof(bay_grid[k].tag) - 1] = '\0';</w:t>
+              <w:br/>
+              <w:t xml:space="preserve">            return bay_grid[k].bayNum;</w:t>
+              <w:br/>
+              <w:t xml:space="preserve">        }</w:t>
+              <w:br/>
+              <w:t xml:space="preserve">    }</w:t>
+              <w:br/>
+              <w:t xml:space="preserve">    return -1;   /* no bay of this category is free */</w:t>
+              <w:br/>
+              <w:t>}</w:t>
+              <w:br/>
+              <w:br/>
+              <w:t>/* release_bay() clears the bay that holds a given vehicle tag */</w:t>
+              <w:br/>
+              <w:t>static int release_bay(const char *tag)</w:t>
+              <w:br/>
+              <w:t>{</w:t>
+              <w:br/>
+              <w:t xml:space="preserve">    int k;</w:t>
+              <w:br/>
+              <w:t xml:space="preserve">    for (k = 0; k &lt; BAY_COUNT; k++) {</w:t>
+              <w:br/>
+              <w:t xml:space="preserve">        if (bay_grid[k].status == BAY_BUSY &amp;&amp; same_tag(bay_grid[k].tag, tag)) {</w:t>
+              <w:br/>
+              <w:t xml:space="preserve">            bay_grid[k].status       = BAY_FREE;</w:t>
+              <w:br/>
+              <w:t xml:space="preserve">            bay_grid[k].tag[0]       = '\0';</w:t>
+              <w:br/>
+              <w:t xml:space="preserve">            bay_grid[k].passNo       = 0;</w:t>
+              <w:br/>
+              <w:t xml:space="preserve">            bay_grid[k].arrivalEpoch = 0;</w:t>
+              <w:br/>
+              <w:t xml:space="preserve">            return k;</w:t>
+              <w:br/>
+              <w:t xml:space="preserve">        }</w:t>
+              <w:br/>
+              <w:t xml:space="preserve">    }</w:t>
+              <w:br/>
+              <w:t xml:space="preserve">    return -1;</w:t>
+              <w:br/>
+              <w:t>}</w:t>
+              <w:br/>
+              <w:br/>
+              <w:t>/* ============================================================</w:t>
+              <w:br/>
+              <w:t xml:space="preserve"> *  VEHICLE ARRIVAL  (Check-In)</w:t>
+              <w:br/>
+              <w:t xml:space="preserve"> * ============================================================ */</w:t>
+              <w:br/>
+              <w:br/>
+              <w:t>void vehicle_arrive(const char *tag, const char *driver,</w:t>
+              <w:br/>
+              <w:t xml:space="preserve">                    int cat, long customEpoch)</w:t>
+              <w:br/>
+              <w:t>{</w:t>
+              <w:br/>
+              <w:t xml:space="preserve">    int k;</w:t>
+              <w:br/>
+              <w:t xml:space="preserve">    /* Reject duplicate: vehicle already occupies a bay */</w:t>
+              <w:br/>
+              <w:t xml:space="preserve">    for (k = 0; k &lt; BAY_COUNT; k++) {</w:t>
+              <w:br/>
+              <w:t xml:space="preserve">        if (bay_grid[k].status == BAY_BUSY &amp;&amp; same_tag(bay_grid[k].tag, tag)) {</w:t>
+              <w:br/>
+              <w:t xml:space="preserve">            printf("  [WARN] %s is already in Bay #%d.\n", tag, bay_grid[k].bayNum);</w:t>
+              <w:br/>
+              <w:t xml:space="preserve">            return;</w:t>
+              <w:br/>
+              <w:t xml:space="preserve">        }</w:t>
+              <w:br/>
+              <w:t xml:space="preserve">    }</w:t>
+              <w:br/>
+              <w:br/>
+              <w:t xml:space="preserve">    long arrEp = (customEpoch &gt; 0) ? customEpoch : (long)time(NULL);</w:t>
+              <w:br/>
+              <w:t xml:space="preserve">    int  pass  = pass_ctr++;</w:t>
+              <w:br/>
+              <w:t xml:space="preserve">    int  bay   = assign_bay(cat, tag, pass, arrEp);</w:t>
+              <w:br/>
+              <w:br/>
+              <w:t xml:space="preserve">    if (bay != -1) {</w:t>
+              <w:br/>
+              <w:t xml:space="preserve">        char ts[24];</w:t>
+              <w:br/>
+              <w:t xml:space="preserve">        epoch_to_str(arrEp, ts, sizeof(ts));</w:t>
+              <w:br/>
+              <w:t xml:space="preserve">        printf("\n  +-- ENTRY PASS GENERATED ---------------------------------+\n");</w:t>
+              <w:br/>
+              <w:t xml:space="preserve">        printf("  | Pass   : #%d\n", pass);</w:t>
+              <w:br/>
+              <w:t xml:space="preserve">        printf("  | Vehicle: %-14s   Driver : %-20s |\n", tag, driver);</w:t>
+              <w:br/>
+              <w:t xml:space="preserve">        printf("  | Type   : %-14s   Bay #%02d  Level %d               |\n",</w:t>
+              <w:br/>
+              <w:t xml:space="preserve">               cat_label(cat), bay, bay_grid[bay-1].levelNum);</w:t>
+              <w:br/>
+              <w:t xml:space="preserve">        printf("  | Arrived: %-28s                     |\n", ts);</w:t>
+              <w:br/>
+              <w:t xml:space="preserve">        printf("  | Rate   : Rs.%.0f/hr                                    |\n",</w:t>
+              <w:br/>
+              <w:t xml:space="preserve">               hourly_rate(cat));</w:t>
+              <w:br/>
+              <w:t xml:space="preserve">        printf("  +---------------------------------------------------------+\n");</w:t>
               <w:br/>
               <w:t xml:space="preserve">    } else {</w:t>
               <w:br/>
-              <w:t xml:space="preserve">        waitQueue.rear-&gt;next = node;</w:t>
-              <w:br/>
-              <w:t xml:space="preserve">        waitQueue.rear = node;</w:t>
+              <w:t xml:space="preserve">        /* Lot is full for this category — add to FIFO hold queue */</w:t>
+              <w:br/>
+              <w:t xml:space="preserve">        CarInfo ci;</w:t>
+              <w:br/>
+              <w:t xml:space="preserve">        strncpy(ci.tag, tag, sizeof(ci.tag)-1);</w:t>
+              <w:br/>
+              <w:t xml:space="preserve">        ci.tag[sizeof(ci.tag)-1] = '\0';</w:t>
+              <w:br/>
+              <w:t xml:space="preserve">        strncpy(ci.driverName, driver, sizeof(ci.driverName)-1);</w:t>
+              <w:br/>
+              <w:t xml:space="preserve">        ci.driverName[sizeof(ci.driverName)-1] = '\0';</w:t>
+              <w:br/>
+              <w:t xml:space="preserve">        ci.category = cat;</w:t>
+              <w:br/>
+              <w:t xml:space="preserve">        push_hold(ci);</w:t>
               <w:br/>
               <w:t xml:space="preserve">    }</w:t>
               <w:br/>
-              <w:t xml:space="preserve">    waitQueue.count++;</w:t>
-              <w:br/>
-              <w:t xml:space="preserve">    printf("   [!] Lot Full! Vehicle '%s' entered Waiting Queue (Position #%d)\n", v.plate, waitQueue.count);</w:t>
-              <w:br/>
               <w:t>}</w:t>
               <w:br/>
               <w:br/>
-              <w:t>bool dequeue_wait(Vehicle* out) {</w:t>
-              <w:br/>
-              <w:t xml:space="preserve">    if (waitQueue.front == NULL) return false;</w:t>
-              <w:br/>
-              <w:t xml:space="preserve">    QueueNode* temp = waitQueue.front;</w:t>
-              <w:br/>
-              <w:t xml:space="preserve">    if (out) *out = temp-&gt;vehicle;</w:t>
-              <w:br/>
-              <w:t xml:space="preserve">    waitQueue.front = waitQueue.front-&gt;next;</w:t>
-              <w:br/>
-              <w:t xml:space="preserve">    if (waitQueue.front == NULL) waitQueue.rear = NULL;</w:t>
-              <w:br/>
-              <w:t xml:space="preserve">    free(temp);</w:t>
-              <w:br/>
-              <w:t xml:space="preserve">    waitQueue.count--;</w:t>
-              <w:br/>
-              <w:t xml:space="preserve">    return true;</w:t>
+              <w:t>/* ============================================================</w:t>
+              <w:br/>
+              <w:t xml:space="preserve"> *  VEHICLE DEPARTURE  (Check-Out + Billing)</w:t>
+              <w:br/>
+              <w:t xml:space="preserve"> * ============================================================ */</w:t>
+              <w:br/>
+              <w:br/>
+              <w:t>void vehicle_depart(const char *tag, long customEpoch)</w:t>
+              <w:br/>
+              <w:t>{</w:t>
+              <w:br/>
+              <w:t xml:space="preserve">    int k;</w:t>
+              <w:br/>
+              <w:t xml:space="preserve">    int foundIdx = -1;</w:t>
+              <w:br/>
+              <w:br/>
+              <w:t xml:space="preserve">    /* Linear search across the bay_grid array */</w:t>
+              <w:br/>
+              <w:t xml:space="preserve">    for (k = 0; k &lt; BAY_COUNT; k++) {</w:t>
+              <w:br/>
+              <w:t xml:space="preserve">        if (bay_grid[k].status == BAY_BUSY &amp;&amp; same_tag(bay_grid[k].tag, tag)) {</w:t>
+              <w:br/>
+              <w:t xml:space="preserve">            foundIdx = k;</w:t>
+              <w:br/>
+              <w:t xml:space="preserve">            break;</w:t>
+              <w:br/>
+              <w:t xml:space="preserve">        }</w:t>
+              <w:br/>
+              <w:t xml:space="preserve">    }</w:t>
+              <w:br/>
+              <w:t xml:space="preserve">    if (foundIdx == -1) {</w:t>
+              <w:br/>
+              <w:t xml:space="preserve">        printf("  [WARN] '%s' is not in any active bay.\n", tag);</w:t>
+              <w:br/>
+              <w:t xml:space="preserve">        return;</w:t>
+              <w:br/>
+              <w:t xml:space="preserve">    }</w:t>
+              <w:br/>
+              <w:br/>
+              <w:t xml:space="preserve">    ParkBay snap    = bay_grid[foundIdx];</w:t>
+              <w:br/>
+              <w:t xml:space="preserve">    long    outEp   = (customEpoch &gt; 0) ? customEpoch : (long)time(NULL);</w:t>
+              <w:br/>
+              <w:t xml:space="preserve">    float   rawHrs  = (float)difftime((time_t)outEp, (time_t)snap.arrivalEpoch) / 3600.0f;</w:t>
+              <w:br/>
+              <w:t xml:space="preserve">    float   billHrs = (rawHrs &lt; (float)MIN_BILLABLE) ? (float)MIN_BILLABLE : rawHrs;</w:t>
+              <w:br/>
+              <w:br/>
+              <w:t xml:space="preserve">    /* Query AI model for the departure hour */</w:t>
+              <w:br/>
+              <w:t xml:space="preserve">    struct tm *dptm = localtime((time_t *)&amp;outEp);</w:t>
+              <w:br/>
+              <w:t xml:space="preserve">    int    hr       = dptm ? dptm-&gt;tm_hour : 12;</w:t>
+              <w:br/>
+              <w:t xml:space="preserve">    float  sc       = peak_score(hr);</w:t>
+              <w:br/>
+              <w:t xml:space="preserve">    float  mult     = pricing_mult(sc);</w:t>
+              <w:br/>
+              <w:t xml:space="preserve">    float  rate     = hourly_rate(snap.category);</w:t>
+              <w:br/>
+              <w:t xml:space="preserve">    float  fee      = rate * billHrs * mult;</w:t>
+              <w:br/>
+              <w:br/>
+              <w:t xml:space="preserve">    /* Prepend a new ExitLog node to the billing linked list */</w:t>
+              <w:br/>
+              <w:t xml:space="preserve">    ExitLog *rec = (ExitLog *)malloc(sizeof(ExitLog));</w:t>
+              <w:br/>
+              <w:t xml:space="preserve">    if (!rec) { fprintf(stderr, "Memory error — billing.\n"); return; }</w:t>
+              <w:br/>
+              <w:t xml:space="preserve">    rec-&gt;passNo     = snap.passNo;</w:t>
+              <w:br/>
+              <w:t xml:space="preserve">    rec-&gt;category   = snap.category;</w:t>
+              <w:br/>
+              <w:t xml:space="preserve">    rec-&gt;bayNum     = snap.bayNum;</w:t>
+              <w:br/>
+              <w:t xml:space="preserve">    rec-&gt;inEpoch    = snap.arrivalEpoch;</w:t>
+              <w:br/>
+              <w:t xml:space="preserve">    rec-&gt;outEpoch   = outEp;</w:t>
+              <w:br/>
+              <w:t xml:space="preserve">    rec-&gt;hoursParked= billHrs;</w:t>
+              <w:br/>
+              <w:t xml:space="preserve">    rec-&gt;peakMult   = mult;</w:t>
+              <w:br/>
+              <w:t xml:space="preserve">    rec-&gt;feePaid    = fee;</w:t>
+              <w:br/>
+              <w:t xml:space="preserve">    strncpy(rec-&gt;tag, snap.tag, sizeof(rec-&gt;tag)-1);</w:t>
+              <w:br/>
+              <w:t xml:space="preserve">    rec-&gt;tag[sizeof(rec-&gt;tag)-1] = '\0';</w:t>
+              <w:br/>
+              <w:t xml:space="preserve">    rec-&gt;prev = ledger;</w:t>
+              <w:br/>
+              <w:t xml:space="preserve">    ledger    = rec;</w:t>
+              <w:br/>
+              <w:br/>
+              <w:t xml:space="preserve">    vault    += fee;</w:t>
+              <w:br/>
+              <w:t xml:space="preserve">    closed_n++;</w:t>
+              <w:br/>
+              <w:br/>
+              <w:t xml:space="preserve">    /* Print payment receipt */</w:t>
+              <w:br/>
+              <w:t xml:space="preserve">    char arrStr[24], dptStr[24];</w:t>
+              <w:br/>
+              <w:t xml:space="preserve">    epoch_to_str(snap.arrivalEpoch, arrStr, sizeof(arrStr));</w:t>
+              <w:br/>
+              <w:t xml:space="preserve">    epoch_to_str(outEp, dptStr, sizeof(dptStr));</w:t>
+              <w:br/>
+              <w:br/>
+              <w:t xml:space="preserve">    printf("\n  +============== PAYMENT RECEIPT ==========================+\n");</w:t>
+              <w:br/>
+              <w:t xml:space="preserve">    printf("  | Pass #%-6d   Vehicle : %-26s   |\n", rec-&gt;passNo, rec-&gt;tag);</w:t>
+              <w:br/>
+              <w:t xml:space="preserve">    printf("  | Type  : %-38s   |\n", cat_label(rec-&gt;category));</w:t>
+              <w:br/>
+              <w:t xml:space="preserve">    printf("  | Bay   : #%02d   Arrived : %-28s|\n", rec-&gt;bayNum, arrStr);</w:t>
+              <w:br/>
+              <w:t xml:space="preserve">    printf("  | Depart: %-38s   |\n", dptStr);</w:t>
+              <w:br/>
+              <w:t xml:space="preserve">    printf("  | Hours : %.1f hrs   Rate : Rs.%.0f/hr                   |\n",</w:t>
+              <w:br/>
+              <w:t xml:space="preserve">           billHrs, rate);</w:t>
+              <w:br/>
+              <w:t xml:space="preserve">    printf("  | PeakScore: %.2f   Price-Mult: x%.2f                    |\n",</w:t>
+              <w:br/>
+              <w:t xml:space="preserve">           sc, mult);</w:t>
+              <w:br/>
+              <w:t xml:space="preserve">    printf("  |---------------------------------------------------------|\n");</w:t>
+              <w:br/>
+              <w:t xml:space="preserve">    printf("  | AMOUNT DUE : Rs. %.2f                                |\n", fee);</w:t>
+              <w:br/>
+              <w:t xml:space="preserve">    printf("  +=========================================================+\n");</w:t>
+              <w:br/>
+              <w:br/>
+              <w:t xml:space="preserve">    /* Free the bay in the array */</w:t>
+              <w:br/>
+              <w:t xml:space="preserve">    release_bay(tag);</w:t>
+              <w:br/>
+              <w:t xml:space="preserve">    printf("  [BAY] Bay #%02d is now free.\n", snap.bayNum);</w:t>
+              <w:br/>
+              <w:br/>
+              <w:t xml:space="preserve">    /* Auto-assign freed bay to the first matching car in the queue */</w:t>
+              <w:br/>
+              <w:t xml:space="preserve">    if (hold_line.size &gt; 0 &amp;&amp; hold_line.head-&gt;car.category == snap.category) {</w:t>
+              <w:br/>
+              <w:t xml:space="preserve">        CarInfo waiting;</w:t>
+              <w:br/>
+              <w:t xml:space="preserve">        pop_hold(&amp;waiting);</w:t>
+              <w:br/>
+              <w:t xml:space="preserve">        int nb = assign_bay(waiting.category, waiting.tag, pass_ctr++, outEp);</w:t>
+              <w:br/>
+              <w:t xml:space="preserve">        if (nb != -1)</w:t>
+              <w:br/>
+              <w:t xml:space="preserve">            printf("  [AUTO] '%s' moved from queue to Bay #%02d.\n\n", waiting.tag, nb);</w:t>
+              <w:br/>
+              <w:t xml:space="preserve">    }</w:t>
               <w:br/>
               <w:t>}</w:t>
               <w:br/>
               <w:br/>
-              <w:t>/* --- AI Demand Prediction Module --- */</w:t>
-              <w:br/>
-              <w:t>/* Models 24-hr urban congestion curve and calculates dynamic surge tariff */</w:t>
-              <w:br/>
-              <w:t>void ai_predict_demand(int hour, double* demandPct, double* surge) {</w:t>
-              <w:br/>
-              <w:t xml:space="preserve">    if (hour &lt; 0 || hour &gt; 23) hour = 12;</w:t>
-              <w:br/>
-              <w:t xml:space="preserve">    </w:t>
-              <w:br/>
-              <w:t xml:space="preserve">    /* Heuristic peak curve: morning rush (8-10 AM) and evening rush (5-7 PM) */</w:t>
-              <w:br/>
-              <w:t xml:space="preserve">    double base;</w:t>
-              <w:br/>
-              <w:t xml:space="preserve">    if (hour &gt;= 8 &amp;&amp; hour &lt;= 10) base = 0.90;      /* Morning peak */</w:t>
-              <w:br/>
-              <w:t xml:space="preserve">    else if (hour &gt;= 17 &amp;&amp; hour &lt;= 19) base = 0.94; /* Evening peak */</w:t>
-              <w:br/>
-              <w:t xml:space="preserve">    else if (hour &gt;= 11 &amp;&amp; hour &lt;= 16) base = 0.72; /* Afternoon busy */</w:t>
-              <w:br/>
-              <w:t xml:space="preserve">    else if (hour &gt;= 6 &amp;&amp; hour &lt;= 7) base = 0.40;   /* Early morning */</w:t>
-              <w:br/>
-              <w:t xml:space="preserve">    else base = 0.15;                               /* Night / off-peak */</w:t>
-              <w:br/>
-              <w:t xml:space="preserve">    </w:t>
-              <w:br/>
-              <w:t xml:space="preserve">    if (demandPct) *demandPct = base * 100.0;</w:t>
-              <w:br/>
-              <w:t xml:space="preserve">    if (surge) {</w:t>
-              <w:br/>
-              <w:t xml:space="preserve">        if (base &gt;= 0.85) *surge = 1.50;      /* Surge tariff */</w:t>
-              <w:br/>
-              <w:t xml:space="preserve">        else if (base &gt;= 0.70) *surge = 1.25; /* Moderate tariff */</w:t>
-              <w:br/>
-              <w:t xml:space="preserve">        else if (base &lt;= 0.25) *surge = 0.85; /* Off-peak discount */</w:t>
-              <w:br/>
-              <w:t xml:space="preserve">        else *surge = 1.00;                   /* Standard tariff */</w:t>
+              <w:t>/* ============================================================</w:t>
+              <w:br/>
+              <w:t xml:space="preserve"> *  SEARCHING — Linear Scan</w:t>
+              <w:br/>
+              <w:t xml:space="preserve"> * ============================================================ */</w:t>
+              <w:br/>
+              <w:br/>
+              <w:t>int find_vehicle(const char *tag)</w:t>
+              <w:br/>
+              <w:t>{</w:t>
+              <w:br/>
+              <w:t xml:space="preserve">    int k;</w:t>
+              <w:br/>
+              <w:t xml:space="preserve">    for (k = 0; k &lt; BAY_COUNT; k++)</w:t>
+              <w:br/>
+              <w:t xml:space="preserve">        if (bay_grid[k].status == BAY_BUSY &amp;&amp; same_tag(bay_grid[k].tag, tag))</w:t>
+              <w:br/>
+              <w:t xml:space="preserve">            return bay_grid[k].bayNum;</w:t>
+              <w:br/>
+              <w:t xml:space="preserve">    return -1;</w:t>
+              <w:br/>
+              <w:t>}</w:t>
+              <w:br/>
+              <w:br/>
+              <w:t>/* ============================================================</w:t>
+              <w:br/>
+              <w:t xml:space="preserve"> *  SORTING — Insertion Sort on billing records (descending fee)</w:t>
+              <w:br/>
+              <w:t xml:space="preserve"> *</w:t>
+              <w:br/>
+              <w:t xml:space="preserve"> *  Why Insertion Sort?</w:t>
+              <w:br/>
+              <w:t xml:space="preserve"> *    The billing ledger is a linked list.  We extract node pointers</w:t>
+              <w:br/>
+              <w:t xml:space="preserve"> *    into a small helper array and sort in-place.  Insertion sort</w:t>
+              <w:br/>
+              <w:t xml:space="preserve"> *    suits small-to-medium datasets (typical for a parking lot)</w:t>
+              <w:br/>
+              <w:t xml:space="preserve"> *    and produces stable, predictable output — useful when fees</w:t>
+              <w:br/>
+              <w:t xml:space="preserve"> *    are equal (ties are kept in arrival order).</w:t>
+              <w:br/>
+              <w:t xml:space="preserve"> * ============================================================ */</w:t>
+              <w:br/>
+              <w:br/>
+              <w:t>void show_sorted_sessions(void)</w:t>
+              <w:br/>
+              <w:t>{</w:t>
+              <w:br/>
+              <w:t xml:space="preserve">    int i, j, n = 0;</w:t>
+              <w:br/>
+              <w:t xml:space="preserve">    ExitLog *cur = ledger;</w:t>
+              <w:br/>
+              <w:br/>
+              <w:t xml:space="preserve">    if (!cur) { printf("  No completed sessions yet.\n"); return; }</w:t>
+              <w:br/>
+              <w:br/>
+              <w:t xml:space="preserve">    /* Count nodes in the list */</w:t>
+              <w:br/>
+              <w:t xml:space="preserve">    while (cur) { n++; cur = cur-&gt;prev; }</w:t>
+              <w:br/>
+              <w:br/>
+              <w:t xml:space="preserve">    ExitLog **arr = (ExitLog **)malloc((size_t)n * sizeof(ExitLog *));</w:t>
+              <w:br/>
+              <w:t xml:space="preserve">    if (!arr) return;</w:t>
+              <w:br/>
+              <w:br/>
+              <w:t xml:space="preserve">    /* Load pointers into the helper array */</w:t>
+              <w:br/>
+              <w:t xml:space="preserve">    cur = ledger;</w:t>
+              <w:br/>
+              <w:t xml:space="preserve">    for (i = 0; i &lt; n; i++, cur = cur-&gt;prev) arr[i] = cur;</w:t>
+              <w:br/>
+              <w:br/>
+              <w:t xml:space="preserve">    /* Insertion sort — descending by feePaid */</w:t>
+              <w:br/>
+              <w:t xml:space="preserve">    for (i = 1; i &lt; n; i++) {</w:t>
+              <w:br/>
+              <w:t xml:space="preserve">        ExitLog *key = arr[i];</w:t>
+              <w:br/>
+              <w:t xml:space="preserve">        j = i - 1;</w:t>
+              <w:br/>
+              <w:t xml:space="preserve">        while (j &gt;= 0 &amp;&amp; arr[j]-&gt;feePaid &lt; key-&gt;feePaid) {</w:t>
+              <w:br/>
+              <w:t xml:space="preserve">            arr[j+1] = arr[j];</w:t>
+              <w:br/>
+              <w:t xml:space="preserve">            j--;</w:t>
+              <w:br/>
+              <w:t xml:space="preserve">        }</w:t>
+              <w:br/>
+              <w:t xml:space="preserve">        arr[j+1] = key;</w:t>
               <w:br/>
               <w:t xml:space="preserve">    }</w:t>
               <w:br/>
+              <w:br/>
+              <w:t xml:space="preserve">    printf("\n  +-- Sessions Ranked by Fee Collected (High -&gt; Low) ------+\n");</w:t>
+              <w:br/>
+              <w:t xml:space="preserve">    printf("  | Rank | Pass   | Vehicle        | Hrs   | Fee (Rs)  |\n");</w:t>
+              <w:br/>
+              <w:t xml:space="preserve">    printf("  |------+--------+----------------+-------+-----------|\n");</w:t>
+              <w:br/>
+              <w:t xml:space="preserve">    for (i = 0; i &lt; n; i++) {</w:t>
+              <w:br/>
+              <w:t xml:space="preserve">        printf("  | %4d | #%-5d | %-14s | %5.1f | %9.2f |\n",</w:t>
+              <w:br/>
+              <w:t xml:space="preserve">               i+1, arr[i]-&gt;passNo, arr[i]-&gt;tag,</w:t>
+              <w:br/>
+              <w:t xml:space="preserve">               arr[i]-&gt;hoursParked, arr[i]-&gt;feePaid);</w:t>
+              <w:br/>
+              <w:t xml:space="preserve">    }</w:t>
+              <w:br/>
+              <w:t xml:space="preserve">    printf("  +--------------------------------------------------------+\n\n");</w:t>
+              <w:br/>
+              <w:t xml:space="preserve">    free(arr);</w:t>
+              <w:br/>
               <w:t>}</w:t>
               <w:br/>
               <w:br/>
-              <w:t>/* --- Slot Allocation (Arrays) --- */</w:t>
-              <w:br/>
-              <w:t>int allocate_slot(VehicleType type, const char* plate, int tId, time_t tEntry) {</w:t>
-              <w:br/>
-              <w:t xml:space="preserve">    for (int i = 0; i &lt; TOTAL_SLOTS; i++) {</w:t>
-              <w:br/>
-              <w:t xml:space="preserve">        if (!slots[i].isOccupied &amp;&amp; slots[i].type == type) {</w:t>
-              <w:br/>
-              <w:t xml:space="preserve">            slots[i].isOccupied = true;</w:t>
-              <w:br/>
-              <w:t xml:space="preserve">            strncpy(slots[i].plate, plate, sizeof(slots[i].plate) - 1);</w:t>
-              <w:br/>
-              <w:t xml:space="preserve">            slots[i].ticketId = tId;</w:t>
-              <w:br/>
-              <w:t xml:space="preserve">            slots[i].entryTime = tEntry;</w:t>
-              <w:br/>
-              <w:t xml:space="preserve">            return slots[i].id;</w:t>
+              <w:t>/* ============================================================</w:t>
+              <w:br/>
+              <w:t xml:space="preserve"> *  BINARY SEARCH — find a session by pass number</w:t>
+              <w:br/>
+              <w:t xml:space="preserve"> *  (array must be sorted by passNo ascending before calling)</w:t>
+              <w:br/>
+              <w:t xml:space="preserve"> * ============================================================ */</w:t>
+              <w:br/>
+              <w:br/>
+              <w:t>static int bsearch_pass(ExitLog **arr, int n, int target)</w:t>
+              <w:br/>
+              <w:t>{</w:t>
+              <w:br/>
+              <w:t xml:space="preserve">    int lo = 0, hi = n - 1;</w:t>
+              <w:br/>
+              <w:t xml:space="preserve">    while (lo &lt;= hi) {</w:t>
+              <w:br/>
+              <w:t xml:space="preserve">        int mid = lo + (hi - lo) / 2;</w:t>
+              <w:br/>
+              <w:t xml:space="preserve">        if (arr[mid]-&gt;passNo == target) return mid;</w:t>
+              <w:br/>
+              <w:t xml:space="preserve">        if (arr[mid]-&gt;passNo  &lt; target) lo = mid + 1;</w:t>
+              <w:br/>
+              <w:t xml:space="preserve">        else                            hi = mid - 1;</w:t>
+              <w:br/>
+              <w:t xml:space="preserve">    }</w:t>
+              <w:br/>
+              <w:t xml:space="preserve">    return -1;</w:t>
+              <w:br/>
+              <w:t>}</w:t>
+              <w:br/>
+              <w:br/>
+              <w:t>void lookup_pass(int target)</w:t>
+              <w:br/>
+              <w:t>{</w:t>
+              <w:br/>
+              <w:t xml:space="preserve">    int i, j, n = 0;</w:t>
+              <w:br/>
+              <w:t xml:space="preserve">    ExitLog *cur = ledger;</w:t>
+              <w:br/>
+              <w:br/>
+              <w:t xml:space="preserve">    if (!cur) { printf("  No records exist yet.\n"); return; }</w:t>
+              <w:br/>
+              <w:t xml:space="preserve">    while (cur) { n++; cur = cur-&gt;prev; }</w:t>
+              <w:br/>
+              <w:br/>
+              <w:t xml:space="preserve">    ExitLog **arr = (ExitLog **)malloc((size_t)n * sizeof(ExitLog *));</w:t>
+              <w:br/>
+              <w:t xml:space="preserve">    if (!arr) return;</w:t>
+              <w:br/>
+              <w:t xml:space="preserve">    cur = ledger;</w:t>
+              <w:br/>
+              <w:t xml:space="preserve">    for (i = 0; i &lt; n; i++, cur = cur-&gt;prev) arr[i] = cur;</w:t>
+              <w:br/>
+              <w:br/>
+              <w:t xml:space="preserve">    /* Sort by passNo ascending so binary search can work correctly */</w:t>
+              <w:br/>
+              <w:t xml:space="preserve">    for (i = 1; i &lt; n; i++) {</w:t>
+              <w:br/>
+              <w:t xml:space="preserve">        ExitLog *key = arr[i];</w:t>
+              <w:br/>
+              <w:t xml:space="preserve">        j = i - 1;</w:t>
+              <w:br/>
+              <w:t xml:space="preserve">        while (j &gt;= 0 &amp;&amp; arr[j]-&gt;passNo &gt; key-&gt;passNo) {</w:t>
+              <w:br/>
+              <w:t xml:space="preserve">            arr[j+1] = arr[j]; j--;</w:t>
               <w:br/>
               <w:t xml:space="preserve">        }</w:t>
               <w:br/>
+              <w:t xml:space="preserve">        arr[j+1] = key;</w:t>
+              <w:br/>
               <w:t xml:space="preserve">    }</w:t>
               <w:br/>
-              <w:t xml:space="preserve">    return -1; /* Full */</w:t>
+              <w:br/>
+              <w:t xml:space="preserve">    int pos = bsearch_pass(arr, n, target);</w:t>
+              <w:br/>
+              <w:t xml:space="preserve">    if (pos &gt;= 0)</w:t>
+              <w:br/>
+              <w:t xml:space="preserve">        printf("  [FOUND] Pass #%d -&gt; %s | Bay #%d | Rs.%.2f\n",</w:t>
+              <w:br/>
+              <w:t xml:space="preserve">               target, arr[pos]-&gt;tag, arr[pos]-&gt;bayNum, arr[pos]-&gt;feePaid);</w:t>
+              <w:br/>
+              <w:t xml:space="preserve">    else</w:t>
+              <w:br/>
+              <w:t xml:space="preserve">        printf("  [NOT FOUND] Pass #%d has no matching record.\n", target);</w:t>
+              <w:br/>
+              <w:br/>
+              <w:t xml:space="preserve">    free(arr);</w:t>
               <w:br/>
               <w:t>}</w:t>
               <w:br/>
               <w:br/>
-              <w:t>/* --- Vehicle Check-In &amp; Check-Out --- */</w:t>
-              <w:br/>
-              <w:t>void check_in(const char* plate, const char* owner, VehicleType type, time_t customEntry) {</w:t>
-              <w:br/>
-              <w:t xml:space="preserve">    for (int i = 0; i &lt; TOTAL_SLOTS; i++) {</w:t>
-              <w:br/>
-              <w:t xml:space="preserve">        if (slots[i].isOccupied &amp;&amp; str_equals_ignore_case(slots[i].plate, plate)) {</w:t>
-              <w:br/>
-              <w:t xml:space="preserve">            printf("   [!] Vehicle '%s' is already parked in Slot #%d!\n", plate, slots[i].id);</w:t>
-              <w:br/>
-              <w:t xml:space="preserve">            return;</w:t>
+              <w:t>/* ============================================================</w:t>
+              <w:br/>
+              <w:t xml:space="preserve"> *  DISPLAY UTILITIES</w:t>
+              <w:br/>
+              <w:t xml:space="preserve"> * ============================================================ */</w:t>
+              <w:br/>
+              <w:br/>
+              <w:t>void show_bay_layout(void)</w:t>
+              <w:br/>
+              <w:t>{</w:t>
+              <w:br/>
+              <w:t xml:space="preserve">    int lv, k;</w:t>
+              <w:br/>
+              <w:t xml:space="preserve">    printf("\n  +-- Bay Layout Map ----------------------------------------+\n");</w:t>
+              <w:br/>
+              <w:t xml:space="preserve">    for (lv = 0; lv &lt; 2; lv++) {</w:t>
+              <w:br/>
+              <w:t xml:space="preserve">        printf("  | Level %d: ", lv);</w:t>
+              <w:br/>
+              <w:t xml:space="preserve">        for (k = 0; k &lt; BAY_COUNT; k++) {</w:t>
+              <w:br/>
+              <w:t xml:space="preserve">            if (bay_grid[k].levelNum == lv)</w:t>
+              <w:br/>
+              <w:t xml:space="preserve">                printf("[%02d:%s] ",</w:t>
+              <w:br/>
+              <w:t xml:space="preserve">                       bay_grid[k].bayNum,</w:t>
+              <w:br/>
+              <w:t xml:space="preserve">                       (bay_grid[k].status == BAY_FREE) ? "--" : "XX");</w:t>
               <w:br/>
               <w:t xml:space="preserve">        }</w:t>
               <w:br/>
+              <w:t xml:space="preserve">        printf("|\n");</w:t>
+              <w:br/>
               <w:t xml:space="preserve">    }</w:t>
               <w:br/>
-              <w:br/>
-              <w:t xml:space="preserve">    time_t entryT = (customEntry != 0) ? customEntry : time(NULL);</w:t>
-              <w:br/>
-              <w:t xml:space="preserve">    int tId = nextTicket++;</w:t>
-              <w:br/>
-              <w:t xml:space="preserve">    int slotId = allocate_slot(type, plate, tId, entryT);</w:t>
-              <w:br/>
-              <w:br/>
-              <w:t xml:space="preserve">    if (slotId != -1) {</w:t>
-              <w:br/>
-              <w:t xml:space="preserve">        printf("\n=== ENTRY PASS ISSUED ===");</w:t>
-              <w:br/>
-              <w:t xml:space="preserve">        printf("\n Ticket #%d | Plate: %s | %s | Floor: %d | Slot: #%02d\n",</w:t>
-              <w:br/>
-              <w:t xml:space="preserve">               tId, plate, type_name(type), slots[slotId - 1].floor, slotId);</w:t>
+              <w:t xml:space="preserve">    printf("  | Key: [--] = Vacant   [XX] = Occupied                   |\n");</w:t>
+              <w:br/>
+              <w:t xml:space="preserve">    printf("  +---------------------------------------------------------+\n\n");</w:t>
+              <w:br/>
+              <w:t>}</w:t>
+              <w:br/>
+              <w:br/>
+              <w:t>void show_hold_queue(void)</w:t>
+              <w:br/>
+              <w:t>{</w:t>
+              <w:br/>
+              <w:t xml:space="preserve">    HoldNode *nd = hold_line.head;</w:t>
+              <w:br/>
+              <w:t xml:space="preserve">    int pos = 1;</w:t>
+              <w:br/>
+              <w:t xml:space="preserve">    printf("\n  +-- Hold-Line (FIFO Queue) --------------------------------+\n");</w:t>
+              <w:br/>
+              <w:t xml:space="preserve">    if (!nd) {</w:t>
+              <w:br/>
+              <w:t xml:space="preserve">        printf("  | Queue is currently empty.                               |\n");</w:t>
               <w:br/>
               <w:t xml:space="preserve">    } else {</w:t>
               <w:br/>
-              <w:t xml:space="preserve">        Vehicle v;</w:t>
-              <w:br/>
-              <w:t xml:space="preserve">        strncpy(v.plate, plate, sizeof(v.plate) - 1);</w:t>
-              <w:br/>
-              <w:t xml:space="preserve">        strncpy(v.owner, owner, sizeof(v.owner) - 1);</w:t>
-              <w:br/>
-              <w:t xml:space="preserve">        v.type = type;</w:t>
-              <w:br/>
-              <w:t xml:space="preserve">        enqueue_wait(v);</w:t>
+              <w:t xml:space="preserve">        while (nd) {</w:t>
+              <w:br/>
+              <w:t xml:space="preserve">            printf("  | #%d  %-16s %-14s                   |\n",</w:t>
+              <w:br/>
+              <w:t xml:space="preserve">                   pos, nd-&gt;car.tag, cat_label(nd-&gt;car.category));</w:t>
+              <w:br/>
+              <w:t xml:space="preserve">            nd = nd-&gt;next; pos++;</w:t>
+              <w:br/>
+              <w:t xml:space="preserve">        }</w:t>
               <w:br/>
               <w:t xml:space="preserve">    }</w:t>
               <w:br/>
+              <w:t xml:space="preserve">    printf("  +---------------------------------------------------------+\n\n");</w:t>
+              <w:br/>
               <w:t>}</w:t>
               <w:br/>
               <w:br/>
-              <w:t>void check_out(const char* plate, time_t customExit) {</w:t>
-              <w:br/>
-              <w:t xml:space="preserve">    int idx = -1;</w:t>
-              <w:br/>
-              <w:t xml:space="preserve">    for (int i = 0; i &lt; TOTAL_SLOTS; i++) {</w:t>
-              <w:br/>
-              <w:t xml:space="preserve">        if (slots[i].isOccupied &amp;&amp; str_equals_ignore_case(slots[i].plate, plate)) {</w:t>
-              <w:br/>
-              <w:t xml:space="preserve">            idx = i;</w:t>
-              <w:br/>
-              <w:t xml:space="preserve">            break;</w:t>
+              <w:t>void show_summary(void)</w:t>
+              <w:br/>
+              <w:t>{</w:t>
+              <w:br/>
+              <w:t xml:space="preserve">    int k, occ = 0;</w:t>
+              <w:br/>
+              <w:t xml:space="preserve">    for (k = 0; k &lt; BAY_COUNT; k++)</w:t>
+              <w:br/>
+              <w:t xml:space="preserve">        if (bay_grid[k].status == BAY_BUSY) occ++;</w:t>
+              <w:br/>
+              <w:br/>
+              <w:t xml:space="preserve">    printf("\n  +-- Facility Summary -------------------------------------+\n");</w:t>
+              <w:br/>
+              <w:t xml:space="preserve">    printf("  | Total Bays      : %d                                    |\n", BAY_COUNT);</w:t>
+              <w:br/>
+              <w:t xml:space="preserve">    printf("  | Occupied        : %d                                    |\n", occ);</w:t>
+              <w:br/>
+              <w:t xml:space="preserve">    printf("  | Available       : %d                                    |\n", BAY_COUNT - occ);</w:t>
+              <w:br/>
+              <w:t xml:space="preserve">    printf("  | Hold Queue Size : %d                                    |\n", hold_line.size);</w:t>
+              <w:br/>
+              <w:t xml:space="preserve">    printf("  | Sessions Closed : %d                                    |\n", closed_n);</w:t>
+              <w:br/>
+              <w:t xml:space="preserve">    printf("  | Total Revenue   : Rs. %.2f                           |\n", vault);</w:t>
+              <w:br/>
+              <w:t xml:space="preserve">    printf("  +---------------------------------------------------------+\n\n");</w:t>
+              <w:br/>
+              <w:t>}</w:t>
+              <w:br/>
+              <w:br/>
+              <w:t>/* ============================================================</w:t>
+              <w:br/>
+              <w:t xml:space="preserve"> *  AUTOMATED DEMO  (uses Indian vehicle registration examples)</w:t>
+              <w:br/>
+              <w:t xml:space="preserve"> * ============================================================ */</w:t>
+              <w:br/>
+              <w:br/>
+              <w:t>void run_demo(void)</w:t>
+              <w:br/>
+              <w:t>{</w:t>
+              <w:br/>
+              <w:t xml:space="preserve">    long now = (long)time(NULL);</w:t>
+              <w:br/>
+              <w:br/>
+              <w:t xml:space="preserve">    printf("\n======================================================\n");</w:t>
+              <w:br/>
+              <w:t xml:space="preserve">    printf("   BayTrack — Full-System Demonstration Session       \n");</w:t>
+              <w:br/>
+              <w:t xml:space="preserve">    printf("======================================================\n\n");</w:t>
+              <w:br/>
+              <w:br/>
+              <w:t xml:space="preserve">    /* Vehicles arrive at different times */</w:t>
+              <w:br/>
+              <w:t xml:space="preserve">    vehicle_arrive("KA-05-MJ-7823", "Ramesh Iyer",   CAT_FW, now - 9000);</w:t>
+              <w:br/>
+              <w:t xml:space="preserve">    vehicle_arrive("TN-09-AB-3341", "Meena Suresh",  CAT_TW, now - 7200);</w:t>
+              <w:br/>
+              <w:t xml:space="preserve">    vehicle_arrive("MH-14-CD-6610", "Arjun Patil",   CAT_FW, now - 5400);</w:t>
+              <w:br/>
+              <w:t xml:space="preserve">    vehicle_arrive("AP-28-EF-1120", "Divya Reddy",   CAT_TW, now - 4800);</w:t>
+              <w:br/>
+              <w:t xml:space="preserve">    vehicle_arrive("DL-01-GH-9902", "Priya Mehta",   CAT_FW, now - 3600);</w:t>
+              <w:br/>
+              <w:t xml:space="preserve">    vehicle_arrive("KL-07-JK-4456", "Suresh Nair",   CAT_TW, now - 3000);</w:t>
+              <w:br/>
+              <w:t xml:space="preserve">    vehicle_arrive("TS-11-AA-0001", "Ravi Kumar",    CAT_TW, now - 1800);</w:t>
+              <w:br/>
+              <w:t xml:space="preserve">    vehicle_arrive("GJ-06-BB-0002", "Neha Shah",     CAT_TW, now - 1200);</w:t>
+              <w:br/>
+              <w:t xml:space="preserve">    vehicle_arrive("RJ-14-CC-0003", "Anil Joshi",    CAT_TW, now -  900);</w:t>
+              <w:br/>
+              <w:t xml:space="preserve">    /* All 6 TW bays now full — next TW must queue */</w:t>
+              <w:br/>
+              <w:t xml:space="preserve">    vehicle_arrive("UP-32-DD-0004", "Sunil Verma",   CAT_TW, now -  300);</w:t>
+              <w:br/>
+              <w:br/>
+              <w:t xml:space="preserve">    printf("\n--- Bay Layout after initial arrivals ---\n");</w:t>
+              <w:br/>
+              <w:t xml:space="preserve">    show_bay_layout();</w:t>
+              <w:br/>
+              <w:t xml:space="preserve">    show_hold_queue();</w:t>
+              <w:br/>
+              <w:br/>
+              <w:t xml:space="preserve">    /* Search for a parked vehicle using linear scan */</w:t>
+              <w:br/>
+              <w:t xml:space="preserve">    printf("  [LINEAR SEARCH] Locating 'MH-14-CD-6610'...\n");</w:t>
+              <w:br/>
+              <w:t xml:space="preserve">    int slot = find_vehicle("MH-14-CD-6610");</w:t>
+              <w:br/>
+              <w:t xml:space="preserve">    if (slot != -1)</w:t>
+              <w:br/>
+              <w:t xml:space="preserve">        printf("  [RESULT] Found in Bay #%02d.\n\n", slot);</w:t>
+              <w:br/>
+              <w:br/>
+              <w:t xml:space="preserve">    /* A TW departs — queued UP-32-DD-0004 should auto-occupy freed bay */</w:t>
+              <w:br/>
+              <w:t xml:space="preserve">    printf("  [EXIT] TN-09-AB-3341 departing...\n");</w:t>
+              <w:br/>
+              <w:t xml:space="preserve">    vehicle_depart("TN-09-AB-3341", now);</w:t>
+              <w:br/>
+              <w:br/>
+              <w:t xml:space="preserve">    /* Another exit to build more billing history */</w:t>
+              <w:br/>
+              <w:t xml:space="preserve">    printf("  [EXIT] KA-05-MJ-7823 departing...\n");</w:t>
+              <w:br/>
+              <w:t xml:space="preserve">    vehicle_depart("KA-05-MJ-7823", now);</w:t>
+              <w:br/>
+              <w:br/>
+              <w:t xml:space="preserve">    /* Show billing sessions ranked by fee — uses Insertion Sort */</w:t>
+              <w:br/>
+              <w:t xml:space="preserve">    show_sorted_sessions();</w:t>
+              <w:br/>
+              <w:br/>
+              <w:t xml:space="preserve">    /* Binary-search demo on a known pass number */</w:t>
+              <w:br/>
+              <w:t xml:space="preserve">    printf("  [BINARY SEARCH] Looking up Pass #%d...\n", TICKET_START);</w:t>
+              <w:br/>
+              <w:t xml:space="preserve">    lookup_pass(TICKET_START);</w:t>
+              <w:br/>
+              <w:br/>
+              <w:t xml:space="preserve">    /* AI demand forecast across 24 hours */</w:t>
+              <w:br/>
+              <w:t xml:space="preserve">    printf("\n  [AI FORECAST] 24-Hour Occupancy &amp; Tariff Schedule:\n");</w:t>
+              <w:br/>
+              <w:t xml:space="preserve">    show_forecast();</w:t>
+              <w:br/>
+              <w:br/>
+              <w:t xml:space="preserve">    show_summary();</w:t>
+              <w:br/>
+              <w:br/>
+              <w:t xml:space="preserve">    printf("======================================================\n");</w:t>
+              <w:br/>
+              <w:t xml:space="preserve">    printf("                 Demo Complete.                       \n");</w:t>
+              <w:br/>
+              <w:t xml:space="preserve">    printf("======================================================\n\n");</w:t>
+              <w:br/>
+              <w:t>}</w:t>
+              <w:br/>
+              <w:br/>
+              <w:t>/* ============================================================</w:t>
+              <w:br/>
+              <w:t xml:space="preserve"> *  INTERACTIVE MAIN MENU</w:t>
+              <w:br/>
+              <w:t xml:space="preserve"> * ============================================================ */</w:t>
+              <w:br/>
+              <w:br/>
+              <w:t>static void read_line(char *buf, int sz)</w:t>
+              <w:br/>
+              <w:t>{</w:t>
+              <w:br/>
+              <w:t xml:space="preserve">    if (fgets(buf, sz, stdin))</w:t>
+              <w:br/>
+              <w:t xml:space="preserve">        buf[strcspn(buf, "\r\n")] = '\0';</w:t>
+              <w:br/>
+              <w:t>}</w:t>
+              <w:br/>
+              <w:br/>
+              <w:t>int main(int argc, char *argv[])</w:t>
+              <w:br/>
+              <w:t>{</w:t>
+              <w:br/>
+              <w:t xml:space="preserve">    setup_bay_grid();</w:t>
+              <w:br/>
+              <w:br/>
+              <w:t xml:space="preserve">    /* Headless demo mode: ./baytrack --demo */</w:t>
+              <w:br/>
+              <w:t xml:space="preserve">    if (argc &gt; 1 &amp;&amp; strcmp(argv[1], "--demo") == 0) {</w:t>
+              <w:br/>
+              <w:t xml:space="preserve">        run_demo();</w:t>
+              <w:br/>
+              <w:t xml:space="preserve">        return 0;</w:t>
+              <w:br/>
+              <w:t xml:space="preserve">    }</w:t>
+              <w:br/>
+              <w:br/>
+              <w:t xml:space="preserve">    char line[64];</w:t>
+              <w:br/>
+              <w:t xml:space="preserve">    int  choice;</w:t>
+              <w:br/>
+              <w:br/>
+              <w:t xml:space="preserve">    for (;;) {</w:t>
+              <w:br/>
+              <w:t xml:space="preserve">        printf("\n+==================[ BayTrack Menu ]==================+\n");</w:t>
+              <w:br/>
+              <w:t xml:space="preserve">        printf("|  1. Register Arrival    (Check-In)                  |\n");</w:t>
+              <w:br/>
+              <w:t xml:space="preserve">        printf("|  2. Register Departure  (Check-Out + Bill)          |\n");</w:t>
+              <w:br/>
+              <w:t xml:space="preserve">        printf("|  3. Find Vehicle Bay    (Linear Search)             |\n");</w:t>
+              <w:br/>
+              <w:t xml:space="preserve">        printf("|  4. View Bay Layout Map                             |\n");</w:t>
+              <w:br/>
+              <w:t xml:space="preserve">        printf("|  5. View Hold-Line Queue                            |\n");</w:t>
+              <w:br/>
+              <w:t xml:space="preserve">        printf("|  6. Ranked Billing Sessions (Insertion Sort)        |\n");</w:t>
+              <w:br/>
+              <w:t xml:space="preserve">        printf("|  7. Lookup Pass Number  (Binary Search)             |\n");</w:t>
+              <w:br/>
+              <w:t xml:space="preserve">        printf("|  8. AI Demand Forecast &amp; Tariff Schedule            |\n");</w:t>
+              <w:br/>
+              <w:t xml:space="preserve">        printf("|  9. Facility Summary &amp; Revenue                      |\n");</w:t>
+              <w:br/>
+              <w:t xml:space="preserve">        printf("| 10. Run Automated Demo                              |\n");</w:t>
+              <w:br/>
+              <w:t xml:space="preserve">        printf("|  0. Exit                                            |\n");</w:t>
+              <w:br/>
+              <w:t xml:space="preserve">        printf("+=====================================================+\n");</w:t>
+              <w:br/>
+              <w:t xml:space="preserve">        printf("Choice: ");</w:t>
+              <w:br/>
+              <w:t xml:space="preserve">        read_line(line, sizeof(line));</w:t>
+              <w:br/>
+              <w:t xml:space="preserve">        if (sscanf(line, "%d", &amp;choice) != 1) continue;</w:t>
+              <w:br/>
+              <w:t xml:space="preserve">        if (choice == 0) break;</w:t>
+              <w:br/>
+              <w:br/>
+              <w:t xml:space="preserve">        switch (choice) {</w:t>
+              <w:br/>
+              <w:t xml:space="preserve">            case 1: {</w:t>
+              <w:br/>
+              <w:t xml:space="preserve">                char tag[18], drv[36], cb[4];</w:t>
+              <w:br/>
+              <w:t xml:space="preserve">                int  cat;</w:t>
+              <w:br/>
+              <w:t xml:space="preserve">                printf("Vehicle Number (e.g. KA-01-AB-1234): "); read_line(tag, sizeof(tag));</w:t>
+              <w:br/>
+              <w:t xml:space="preserve">                printf("Driver Name: ");                          read_line(drv, sizeof(drv));</w:t>
+              <w:br/>
+              <w:t xml:space="preserve">                printf("Category (1=Two-Wheeler, 2=Four-Wheeler): "); read_line(cb, sizeof(cb));</w:t>
+              <w:br/>
+              <w:t xml:space="preserve">                cat = (cb[0] == '1') ? CAT_TW : CAT_FW;</w:t>
+              <w:br/>
+              <w:t xml:space="preserve">                vehicle_arrive(tag, drv, cat, 0);</w:t>
+              <w:br/>
+              <w:t xml:space="preserve">                break;</w:t>
+              <w:br/>
+              <w:t xml:space="preserve">            }</w:t>
+              <w:br/>
+              <w:t xml:space="preserve">            case 2: {</w:t>
+              <w:br/>
+              <w:t xml:space="preserve">                char tag[18];</w:t>
+              <w:br/>
+              <w:t xml:space="preserve">                printf("Vehicle Number to Depart: "); read_line(tag, sizeof(tag));</w:t>
+              <w:br/>
+              <w:t xml:space="preserve">                vehicle_depart(tag, 0);</w:t>
+              <w:br/>
+              <w:t xml:space="preserve">                break;</w:t>
+              <w:br/>
+              <w:t xml:space="preserve">            }</w:t>
+              <w:br/>
+              <w:t xml:space="preserve">            case 3: {</w:t>
+              <w:br/>
+              <w:t xml:space="preserve">                char tag[18];</w:t>
+              <w:br/>
+              <w:t xml:space="preserve">                printf("Vehicle Number: "); read_line(tag, sizeof(tag));</w:t>
+              <w:br/>
+              <w:t xml:space="preserve">                int b = find_vehicle(tag);</w:t>
+              <w:br/>
+              <w:t xml:space="preserve">                if (b != -1) printf("  Found in Bay #%02d.\n", b);</w:t>
+              <w:br/>
+              <w:t xml:space="preserve">                else         printf("  Not currently parked here.\n");</w:t>
+              <w:br/>
+              <w:t xml:space="preserve">                break;</w:t>
+              <w:br/>
+              <w:t xml:space="preserve">            }</w:t>
+              <w:br/>
+              <w:t xml:space="preserve">            case 4:  show_bay_layout();      break;</w:t>
+              <w:br/>
+              <w:t xml:space="preserve">            case 5:  show_hold_queue();      break;</w:t>
+              <w:br/>
+              <w:t xml:space="preserve">            case 6:  show_sorted_sessions(); break;</w:t>
+              <w:br/>
+              <w:t xml:space="preserve">            case 7: {</w:t>
+              <w:br/>
+              <w:t xml:space="preserve">                char pb[12]; int p;</w:t>
+              <w:br/>
+              <w:t xml:space="preserve">                printf("Enter Pass Number: "); read_line(pb, sizeof(pb));</w:t>
+              <w:br/>
+              <w:t xml:space="preserve">                if (sscanf(pb, "%d", &amp;p) == 1) lookup_pass(p);</w:t>
+              <w:br/>
+              <w:t xml:space="preserve">                break;</w:t>
+              <w:br/>
+              <w:t xml:space="preserve">            }</w:t>
+              <w:br/>
+              <w:t xml:space="preserve">            case 8:  show_forecast();  break;</w:t>
+              <w:br/>
+              <w:t xml:space="preserve">            case 9:  show_summary();   break;</w:t>
+              <w:br/>
+              <w:t xml:space="preserve">            case 10: run_demo();       break;</w:t>
+              <w:br/>
+              <w:t xml:space="preserve">            default: printf("  Invalid option.\n"); break;</w:t>
               <w:br/>
               <w:t xml:space="preserve">        }</w:t>
               <w:br/>
               <w:t xml:space="preserve">    }</w:t>
               <w:br/>
-              <w:t xml:space="preserve">    if (idx == -1) {</w:t>
-              <w:br/>
-              <w:t xml:space="preserve">        printf("   [!] Vehicle '%s' not found in active slots.\n", plate);</w:t>
-              <w:br/>
-              <w:t xml:space="preserve">        return;</w:t>
-              <w:br/>
-              <w:t xml:space="preserve">    }</w:t>
-              <w:br/>
-              <w:br/>
-              <w:t xml:space="preserve">    time_t exitT = (customExit != 0) ? customExit : time(NULL);</w:t>
-              <w:br/>
-              <w:t xml:space="preserve">    double hours = difftime(exitT, slots[idx].entryTime) / 3600.0;</w:t>
-              <w:br/>
-              <w:t xml:space="preserve">    if (hours &lt; 1.0) hours = 1.0;</w:t>
-              <w:br/>
-              <w:br/>
-              <w:t xml:space="preserve">    struct tm* tmInfo = localtime(&amp;exitT);</w:t>
-              <w:br/>
-              <w:t xml:space="preserve">    int currHour = tmInfo ? tmInfo-&gt;tm_hour : 12;</w:t>
-              <w:br/>
-              <w:t xml:space="preserve">    double demand = 0, surge = 1.0;</w:t>
-              <w:br/>
-              <w:t xml:space="preserve">    ai_predict_demand(currHour, &amp;demand, &amp;surge);</w:t>
-              <w:br/>
-              <w:br/>
-              <w:t xml:space="preserve">    double rate = (slots[idx].type == TYPE_2W) ? RATE_2W : RATE_4W;</w:t>
-              <w:br/>
-              <w:t xml:space="preserve">    double total = rate * hours * surge;</w:t>
-              <w:br/>
-              <w:br/>
-              <w:t xml:space="preserve">    /* Add to Linked List */</w:t>
-              <w:br/>
-              <w:t xml:space="preserve">    RecordNode* rec = (RecordNode*)malloc(sizeof(RecordNode));</w:t>
-              <w:br/>
-              <w:t xml:space="preserve">    rec-&gt;ticketId = slots[idx].ticketId;</w:t>
-              <w:br/>
-              <w:t xml:space="preserve">    strncpy(rec-&gt;plate, slots[idx].plate, sizeof(rec-&gt;plate) - 1);</w:t>
-              <w:br/>
-              <w:t xml:space="preserve">    rec-&gt;type = slots[idx].type;</w:t>
-              <w:br/>
-              <w:t xml:space="preserve">    rec-&gt;slotId = slots[idx].id;</w:t>
-              <w:br/>
-              <w:t xml:space="preserve">    rec-&gt;entryTime = slots[idx].entryTime;</w:t>
-              <w:br/>
-              <w:t xml:space="preserve">    rec-&gt;exitTime = exitT;</w:t>
-              <w:br/>
-              <w:t xml:space="preserve">    rec-&gt;durationHours = hours;</w:t>
-              <w:br/>
-              <w:t xml:space="preserve">    rec-&gt;surgeFactor = surge;</w:t>
-              <w:br/>
-              <w:t xml:space="preserve">    rec-&gt;amount = total;</w:t>
-              <w:br/>
-              <w:t xml:space="preserve">    rec-&gt;next = historyHead;</w:t>
-              <w:br/>
-              <w:t xml:space="preserve">    historyHead = rec;</w:t>
-              <w:br/>
-              <w:br/>
-              <w:t xml:space="preserve">    totalRevenue += total;</w:t>
-              <w:br/>
-              <w:t xml:space="preserve">    completedSessions++;</w:t>
-              <w:br/>
-              <w:br/>
-              <w:t xml:space="preserve">    /* Receipt */</w:t>
-              <w:br/>
-              <w:t xml:space="preserve">    printf("\n**************** BILL RECEIPT ****************\n");</w:t>
-              <w:br/>
-              <w:t xml:space="preserve">    printf(" Ticket #%d | Vehicle: %s (%s)\n", rec-&gt;ticketId, rec-&gt;plate, type_name(rec-&gt;type));</w:t>
-              <w:br/>
-              <w:t xml:space="preserve">    printf(" Duration: %.1f hrs | Rate: $%.2f/hr | AI Surge: %.2fx\n", hours, rate, surge);</w:t>
-              <w:br/>
-              <w:t xml:space="preserve">    printf(" TOTAL CHARGE PAID: $%.2f\n", total);</w:t>
-              <w:br/>
-              <w:t xml:space="preserve">    printf("**********************************************\n");</w:t>
-              <w:br/>
-              <w:br/>
-              <w:t xml:space="preserve">    /* Release slot */</w:t>
-              <w:br/>
-              <w:t xml:space="preserve">    VehicleType freedType = slots[idx].type;</w:t>
-              <w:br/>
-              <w:t xml:space="preserve">    slots[idx].isOccupied = false;</w:t>
-              <w:br/>
-              <w:t xml:space="preserve">    slots[idx].plate[0] = '\0';</w:t>
-              <w:br/>
-              <w:t xml:space="preserve">    printf("   [+] Slot #%02d is now free.\n", slots[idx].id);</w:t>
-              <w:br/>
-              <w:br/>
-              <w:t xml:space="preserve">    /* Queue Auto-Allocation */</w:t>
-              <w:br/>
-              <w:t xml:space="preserve">    if (waitQueue.count &gt; 0 &amp;&amp; waitQueue.front-&gt;vehicle.type == freedType) {</w:t>
-              <w:br/>
-              <w:t xml:space="preserve">        Vehicle queued;</w:t>
-              <w:br/>
-              <w:t xml:space="preserve">        dequeue_wait(&amp;queued);</w:t>
-              <w:br/>
-              <w:t xml:space="preserve">        int newSlot = allocate_slot(queued.type, queued.plate, nextTicket++, exitT);</w:t>
-              <w:br/>
-              <w:t xml:space="preserve">        printf("   &gt;&gt;&gt; [AUTO-ALLOCATION]: Dequeued '%s' and assigned to freed Slot #%02d! &lt;&lt;&lt;\n",</w:t>
-              <w:br/>
-              <w:t xml:space="preserve">               queued.plate, newSlot);</w:t>
-              <w:br/>
-              <w:t xml:space="preserve">    }</w:t>
-              <w:br/>
-              <w:t>}</w:t>
-              <w:br/>
-              <w:br/>
-              <w:t>/* --- Searching &amp; Sorting (DSA) --- */</w:t>
-              <w:br/>
-              <w:t>int linear_search_slot(const char* plate) {</w:t>
-              <w:br/>
-              <w:t xml:space="preserve">    for (int i = 0; i &lt; TOTAL_SLOTS; i++) {</w:t>
-              <w:br/>
-              <w:t xml:space="preserve">        if (slots[i].isOccupied &amp;&amp; str_equals_ignore_case(slots[i].plate, plate)) {</w:t>
-              <w:br/>
-              <w:t xml:space="preserve">            return slots[i].id;</w:t>
-              <w:br/>
-              <w:t xml:space="preserve">        }</w:t>
-              <w:br/>
-              <w:t xml:space="preserve">    }</w:t>
-              <w:br/>
-              <w:t xml:space="preserve">    return -1;</w:t>
-              <w:br/>
-              <w:t>}</w:t>
-              <w:br/>
-              <w:br/>
-              <w:t>void sort_records_by_amount(void) {</w:t>
-              <w:br/>
-              <w:t xml:space="preserve">    if (!historyHead || !historyHead-&gt;next) return;</w:t>
-              <w:br/>
-              <w:t xml:space="preserve">    /* Convert linked list to array of pointers for QuickSort */</w:t>
-              <w:br/>
-              <w:t xml:space="preserve">    int count = completedSessions;</w:t>
-              <w:br/>
-              <w:t xml:space="preserve">    RecordNode** arr = (RecordNode**)malloc(sizeof(RecordNode*) * count);</w:t>
-              <w:br/>
-              <w:t xml:space="preserve">    RecordNode* curr = historyHead;</w:t>
-              <w:br/>
-              <w:t xml:space="preserve">    for (int i = 0; i &lt; count &amp;&amp; curr; i++, curr = curr-&gt;next) arr[i] = curr;</w:t>
-              <w:br/>
-              <w:br/>
-              <w:t xml:space="preserve">    /* Simple Bubble Sort on pointers by charge (Descending) */</w:t>
-              <w:br/>
-              <w:t xml:space="preserve">    for (int i = 0; i &lt; count - 1; i++) {</w:t>
-              <w:br/>
-              <w:t xml:space="preserve">        for (int j = 0; j &lt; count - i - 1; j++) {</w:t>
-              <w:br/>
-              <w:t xml:space="preserve">            if (arr[j]-&gt;amount &lt; arr[j + 1]-&gt;amount) {</w:t>
-              <w:br/>
-              <w:t xml:space="preserve">                RecordNode* tmp = arr[j];</w:t>
-              <w:br/>
-              <w:t xml:space="preserve">                arr[j] = arr[j + 1];</w:t>
-              <w:br/>
-              <w:t xml:space="preserve">                arr[j + 1] = tmp;</w:t>
-              <w:br/>
-              <w:t xml:space="preserve">            }</w:t>
-              <w:br/>
-              <w:t xml:space="preserve">        }</w:t>
-              <w:br/>
-              <w:t xml:space="preserve">    }</w:t>
-              <w:br/>
-              <w:br/>
-              <w:t xml:space="preserve">    printf("\n--- Completed Transactions Sorted by Revenue (Highest to Lowest) ---\n");</w:t>
-              <w:br/>
-              <w:t xml:space="preserve">    for (int i = 0; i &lt; count; i++) {</w:t>
-              <w:br/>
-              <w:t xml:space="preserve">        printf(" Ticket #%d | Plate: %-12s | Time: %.1f hrs | Amount: $%.2f\n",</w:t>
-              <w:br/>
-              <w:t xml:space="preserve">               arr[i]-&gt;ticketId, arr[i]-&gt;plate, arr[i]-&gt;durationHours, arr[i]-&gt;amount);</w:t>
-              <w:br/>
-              <w:t xml:space="preserve">    }</w:t>
-              <w:br/>
-              <w:t xml:space="preserve">    free(arr);</w:t>
-              <w:br/>
-              <w:t>}</w:t>
-              <w:br/>
-              <w:br/>
-              <w:t>int binary_search_ticket(RecordNode** sortedArr, int n, int targetTicket) {</w:t>
-              <w:br/>
-              <w:t xml:space="preserve">    int low = 0, high = n - 1;</w:t>
-              <w:br/>
-              <w:t xml:space="preserve">    while (low &lt;= high) {</w:t>
-              <w:br/>
-              <w:t xml:space="preserve">        int mid = low + (high - low) / 2;</w:t>
-              <w:br/>
-              <w:t xml:space="preserve">        if (sortedArr[mid]-&gt;ticketId == targetTicket) return mid;</w:t>
-              <w:br/>
-              <w:t xml:space="preserve">        if (sortedArr[mid]-&gt;ticketId &lt; targetTicket) low = mid + 1;</w:t>
-              <w:br/>
-              <w:t xml:space="preserve">        else high = mid - 1;</w:t>
-              <w:br/>
-              <w:t xml:space="preserve">    }</w:t>
-              <w:br/>
-              <w:t xml:space="preserve">    return -1;</w:t>
-              <w:br/>
-              <w:t>}</w:t>
-              <w:br/>
-              <w:br/>
-              <w:t>/* --- Visuals &amp; Analytics --- */</w:t>
-              <w:br/>
-              <w:t>void display_slots(void) {</w:t>
-              <w:br/>
-              <w:t xml:space="preserve">    printf("\n--- REAL-TIME PARKING LOT GRID ---\n");</w:t>
-              <w:br/>
-              <w:t xml:space="preserve">    for (int f = 1; f &lt;= 2; f++) {</w:t>
-              <w:br/>
-              <w:t xml:space="preserve">        printf("Floor %d: ", f);</w:t>
-              <w:br/>
-              <w:t xml:space="preserve">        for (int i = 0; i &lt; TOTAL_SLOTS; i++) {</w:t>
-              <w:br/>
-              <w:t xml:space="preserve">            if (slots[i].floor == f) {</w:t>
-              <w:br/>
-              <w:t xml:space="preserve">                printf("[%02d: %s] ", slots[i].id, slots[i].isOccupied ? "X" : "V");</w:t>
-              <w:br/>
-              <w:t xml:space="preserve">            }</w:t>
-              <w:br/>
-              <w:t xml:space="preserve">        }</w:t>
-              <w:br/>
-              <w:t xml:space="preserve">        printf("\n");</w:t>
-              <w:br/>
-              <w:t xml:space="preserve">    }</w:t>
-              <w:br/>
-              <w:t xml:space="preserve">    printf("Legend: [V] = Vacant | [X] = Occupied\n");</w:t>
-              <w:br/>
-              <w:t>}</w:t>
-              <w:br/>
-              <w:br/>
-              <w:t>void display_ai_forecast(void) {</w:t>
-              <w:br/>
-              <w:t xml:space="preserve">    printf("\n=== AI 24-HOUR DEMAND FORECAST &amp; DYNAMIC PRICING ===\n");</w:t>
-              <w:br/>
-              <w:t xml:space="preserve">    printf("Hour  | Demand | Load Visualization      | Tariff Tier\n");</w:t>
-              <w:br/>
-              <w:t xml:space="preserve">    printf("------+--------+-------------------------+--------------\n");</w:t>
-              <w:br/>
-              <w:t xml:space="preserve">    for (int h = 0; h &lt; 24; h += 2) {</w:t>
-              <w:br/>
-              <w:t xml:space="preserve">        double demand = 0, surge = 1.0;</w:t>
-              <w:br/>
-              <w:t xml:space="preserve">        ai_predict_demand(h, &amp;demand, &amp;surge);</w:t>
-              <w:br/>
-              <w:t xml:space="preserve">        int bars = (int)(demand / 5.0);</w:t>
-              <w:br/>
-              <w:t xml:space="preserve">        char barStr[25];</w:t>
-              <w:br/>
-              <w:t xml:space="preserve">        for (int b = 0; b &lt; bars; b++) barStr[b] = '#';</w:t>
-              <w:br/>
-              <w:t xml:space="preserve">        barStr[bars] = '\0';</w:t>
-              <w:br/>
-              <w:t xml:space="preserve">        const char* tag = (surge &gt;= 1.5) ? "HIGH SURGE (1.5x)" :</w:t>
-              <w:br/>
-              <w:t xml:space="preserve">                          (surge &gt;= 1.25) ? "MODERATE   (1.25x)" :</w:t>
-              <w:br/>
-              <w:t xml:space="preserve">                          (surge &lt; 1.0) ? "OFF-PEAK   (0.85x)" : "STANDARD   (1.0x)";</w:t>
-              <w:br/>
-              <w:t xml:space="preserve">        printf("%02d:00 | %5.1f%% | %-20s | %s\n", h, demand, barStr, tag);</w:t>
-              <w:br/>
-              <w:t xml:space="preserve">    }</w:t>
-              <w:br/>
-              <w:t>}</w:t>
-              <w:br/>
-              <w:br/>
-              <w:t>void display_stats(void) {</w:t>
-              <w:br/>
-              <w:t xml:space="preserve">    int occ = 0;</w:t>
-              <w:br/>
-              <w:t xml:space="preserve">    for (int i = 0; i &lt; TOTAL_SLOTS; i++) if (slots[i].isOccupied) occ++;</w:t>
-              <w:br/>
-              <w:t xml:space="preserve">    printf("\n=== PARKING STATISTICS ===\n");</w:t>
-              <w:br/>
-              <w:t xml:space="preserve">    printf(" Capacity: %d slots | Occupied: %d (%.1f%%) | Available: %d\n",</w:t>
-              <w:br/>
-              <w:t xml:space="preserve">           TOTAL_SLOTS, occ, (occ * 100.0) / TOTAL_SLOTS, TOTAL_SLOTS - occ);</w:t>
-              <w:br/>
-              <w:t xml:space="preserve">    printf(" Waiting Queue: %d vehicles | Completed Exits: %d | Revenue: $%.2f\n",</w:t>
-              <w:br/>
-              <w:t xml:space="preserve">           waitQueue.count, completedSessions, totalRevenue);</w:t>
-              <w:br/>
-              <w:t>}</w:t>
-              <w:br/>
-              <w:br/>
-              <w:t>/* --- Automated Simulation Demo --- */</w:t>
-              <w:br/>
-              <w:t>void run_demo(void) {</w:t>
-              <w:br/>
-              <w:t xml:space="preserve">    printf("\n--- RUNNING DEMO SIMULATION ---\n");</w:t>
-              <w:br/>
-              <w:t xml:space="preserve">    time_t t = time(NULL);</w:t>
-              <w:br/>
-              <w:t xml:space="preserve">    check_in("KA-01-1234", "Alice", TYPE_4W, t - 7200);</w:t>
-              <w:br/>
-              <w:t xml:space="preserve">    check_in("DL-02-5678", "Bob", TYPE_2W, t - 3600);</w:t>
-              <w:br/>
-              <w:t xml:space="preserve">    check_in("MH-03-9999", "Charlie", TYPE_4W, t - 1800);</w:t>
-              <w:br/>
-              <w:t xml:space="preserve">    </w:t>
-              <w:br/>
-              <w:t xml:space="preserve">    /* Fill remaining 2W slots to test Queue */</w:t>
-              <w:br/>
-              <w:t xml:space="preserve">    for (int i = 1; i &lt;= 6; i++) {</w:t>
-              <w:br/>
-              <w:t xml:space="preserve">        char p[16];</w:t>
-              <w:br/>
-              <w:t xml:space="preserve">        snprintf(p, sizeof(p), "2W-TEST-%02d", i);</w:t>
-              <w:br/>
-              <w:t xml:space="preserve">        check_in(p, "User", TYPE_2W, t);</w:t>
-              <w:br/>
-              <w:t xml:space="preserve">    }</w:t>
-              <w:br/>
-              <w:t xml:space="preserve">    display_slots();</w:t>
-              <w:br/>
-              <w:t xml:space="preserve">    </w:t>
-              <w:br/>
-              <w:t xml:space="preserve">    printf("\n--&gt; Searching slot for 'DL-02-5678' (Linear Search)...\n");</w:t>
-              <w:br/>
-              <w:t xml:space="preserve">    int s = linear_search_slot("DL-02-5678");</w:t>
-              <w:br/>
-              <w:t xml:space="preserve">    printf("   Found at Slot #%02d\n", s);</w:t>
-              <w:br/>
-              <w:br/>
-              <w:t xml:space="preserve">    printf("\n--&gt; Vehicle Exit &amp; Queue Auto-Allocation...\n");</w:t>
-              <w:br/>
-              <w:t xml:space="preserve">    check_out("DL-02-5678", t);</w:t>
-              <w:br/>
-              <w:t xml:space="preserve">    </w:t>
-              <w:br/>
-              <w:t xml:space="preserve">    display_ai_forecast();</w:t>
-              <w:br/>
-              <w:t xml:space="preserve">    sort_records_by_amount();</w:t>
-              <w:br/>
-              <w:t xml:space="preserve">    display_stats();</w:t>
-              <w:br/>
-              <w:t xml:space="preserve">    printf("\n--- DEMO COMPLETED ---\n\n");</w:t>
-              <w:br/>
-              <w:t>}</w:t>
-              <w:br/>
-              <w:br/>
-              <w:t>/* --- Main Menu --- */</w:t>
-              <w:br/>
-              <w:t>int main(int argc, char* argv[]) {</w:t>
-              <w:br/>
-              <w:t xml:space="preserve">    init_parking();</w:t>
-              <w:br/>
-              <w:br/>
-              <w:t xml:space="preserve">    if (argc &gt; 1 &amp;&amp; strcmp(argv[1], "--demo") == 0) {</w:t>
-              <w:br/>
-              <w:t xml:space="preserve">        run_demo();</w:t>
-              <w:br/>
-              <w:t xml:space="preserve">        return 0;</w:t>
-              <w:br/>
-              <w:t xml:space="preserve">    }</w:t>
-              <w:br/>
-              <w:br/>
-              <w:t xml:space="preserve">    int choice;</w:t>
-              <w:br/>
-              <w:t xml:space="preserve">    char buf[64];</w:t>
-              <w:br/>
-              <w:t xml:space="preserve">    while (1) {</w:t>
-              <w:br/>
-              <w:t xml:space="preserve">        printf("\n=========================================\n");</w:t>
-              <w:br/>
-              <w:t xml:space="preserve">        printf("    SMART PARKING MANAGEMENT SYSTEM      \n");</w:t>
-              <w:br/>
-              <w:t xml:space="preserve">        printf("=========================================\n");</w:t>
-              <w:br/>
-              <w:t xml:space="preserve">        printf(" 1. Check-In Vehicle\n");</w:t>
-              <w:br/>
-              <w:t xml:space="preserve">        printf(" 2. Check-Out &amp; Generate Bill\n");</w:t>
-              <w:br/>
-              <w:t xml:space="preserve">        printf(" 3. Search Slot by License Plate\n");</w:t>
-              <w:br/>
-              <w:t xml:space="preserve">        printf(" 4. View Parking Lot Grid\n");</w:t>
-              <w:br/>
-              <w:t xml:space="preserve">        printf(" 5. Sort Billing Records by Revenue\n");</w:t>
-              <w:br/>
-              <w:t xml:space="preserve">        printf(" 6. AI Demand Forecast &amp; Surge Tariff\n");</w:t>
-              <w:br/>
-              <w:t xml:space="preserve">        printf(" 7. Facility Statistics\n");</w:t>
-              <w:br/>
-              <w:t xml:space="preserve">        printf(" 8. Run Automated Test Demo\n");</w:t>
-              <w:br/>
-              <w:t xml:space="preserve">        printf(" 0. Exit\n");</w:t>
-              <w:br/>
-              <w:t xml:space="preserve">        printf("Choice (0-8): ");</w:t>
-              <w:br/>
-              <w:t xml:space="preserve">        if (!fgets(buf, sizeof(buf), stdin)) break;</w:t>
-              <w:br/>
-              <w:t xml:space="preserve">        if (sscanf(buf, "%d", &amp;choice) != 1) continue;</w:t>
-              <w:br/>
-              <w:t xml:space="preserve">        if (choice == 0) break;</w:t>
-              <w:br/>
-              <w:br/>
-              <w:t xml:space="preserve">        switch (choice) {</w:t>
-              <w:br/>
-              <w:t xml:space="preserve">            case 1: {</w:t>
-              <w:br/>
-              <w:t xml:space="preserve">                char plate[16], owner[32];</w:t>
-              <w:br/>
-              <w:t xml:space="preserve">                int type = 2;</w:t>
-              <w:br/>
-              <w:t xml:space="preserve">                printf("Enter Plate: ");</w:t>
-              <w:br/>
-              <w:t xml:space="preserve">                fgets(plate, sizeof(plate), stdin); plate[strcspn(plate, "\r\n")] = 0;</w:t>
-              <w:br/>
-              <w:t xml:space="preserve">                printf("Enter Owner: ");</w:t>
-              <w:br/>
-              <w:t xml:space="preserve">                fgets(owner, sizeof(owner), stdin); owner[strcspn(owner, "\r\n")] = 0;</w:t>
-              <w:br/>
-              <w:t xml:space="preserve">                printf("Type (1: 2-Wheeler, 2: 4-Wheeler): ");</w:t>
-              <w:br/>
-              <w:t xml:space="preserve">                fgets(buf, sizeof(buf), stdin); sscanf(buf, "%d", &amp;type);</w:t>
-              <w:br/>
-              <w:t xml:space="preserve">                check_in(plate, owner, (VehicleType)type, 0);</w:t>
-              <w:br/>
-              <w:t xml:space="preserve">                break;</w:t>
-              <w:br/>
-              <w:t xml:space="preserve">            }</w:t>
-              <w:br/>
-              <w:t xml:space="preserve">            case 2: {</w:t>
-              <w:br/>
-              <w:t xml:space="preserve">                char plate[16];</w:t>
-              <w:br/>
-              <w:t xml:space="preserve">                printf("Enter Plate to Check-Out: ");</w:t>
-              <w:br/>
-              <w:t xml:space="preserve">                fgets(plate, sizeof(plate), stdin); plate[strcspn(plate, "\r\n")] = 0;</w:t>
-              <w:br/>
-              <w:t xml:space="preserve">                check_out(plate, 0);</w:t>
-              <w:br/>
-              <w:t xml:space="preserve">                break;</w:t>
-              <w:br/>
-              <w:t xml:space="preserve">            }</w:t>
-              <w:br/>
-              <w:t xml:space="preserve">            case 3: {</w:t>
-              <w:br/>
-              <w:t xml:space="preserve">                char plate[16];</w:t>
-              <w:br/>
-              <w:t xml:space="preserve">                printf("Enter Plate: ");</w:t>
-              <w:br/>
-              <w:t xml:space="preserve">                fgets(plate, sizeof(plate), stdin); plate[strcspn(plate, "\r\n")] = 0;</w:t>
-              <w:br/>
-              <w:t xml:space="preserve">                int slot = linear_search_slot(plate);</w:t>
-              <w:br/>
-              <w:t xml:space="preserve">                if (slot != -1) printf("Found: Vehicle '%s' is in Slot #%02d\n", plate, slot);</w:t>
-              <w:br/>
-              <w:t xml:space="preserve">                else printf("Vehicle '%s' not found.\n", plate);</w:t>
-              <w:br/>
-              <w:t xml:space="preserve">                break;</w:t>
-              <w:br/>
-              <w:t xml:space="preserve">            }</w:t>
-              <w:br/>
-              <w:t xml:space="preserve">            case 4: display_slots(); break;</w:t>
-              <w:br/>
-              <w:t xml:space="preserve">            case 5: sort_records_by_amount(); break;</w:t>
-              <w:br/>
-              <w:t xml:space="preserve">            case 6: display_ai_forecast(); break;</w:t>
-              <w:br/>
-              <w:t xml:space="preserve">            case 7: display_stats(); break;</w:t>
-              <w:br/>
-              <w:t xml:space="preserve">            case 8: run_demo(); break;</w:t>
-              <w:br/>
-              <w:t xml:space="preserve">            default: printf("Invalid option.\n"); break;</w:t>
-              <w:br/>
-              <w:t xml:space="preserve">        }</w:t>
-              <w:br/>
-              <w:t xml:space="preserve">    }</w:t>
+              <w:t xml:space="preserve">    printf("Goodbye from BayTrack!\n");</w:t>
               <w:br/>
               <w:t xml:space="preserve">    return 0;</w:t>
               <w:br/>
@@ -962,23 +1557,21 @@
     </w:tbl>
     <w:p>
       <w:pPr>
-        <w:spacing w:before="40" w:after="120"/>
+        <w:spacing w:after="160"/>
       </w:pPr>
     </w:p>
     <w:p>
       <w:pPr>
         <w:pStyle w:val="Heading1"/>
-        <w:spacing w:before="280" w:after="120"/>
+        <w:spacing w:before="280"/>
       </w:pPr>
       <w:r>
-        <w:t>3. Execution Output (Automated Test Simulation)</w:t>
+        <w:t>3. Automated Demo Execution Output</w:t>
       </w:r>
     </w:p>
     <w:tbl>
       <w:tblPr>
         <w:tblW w:type="auto" w:w="0"/>
-        <w:jc w:val="center"/>
-        <w:tblLayout w:type="fixed"/>
         <w:tblLook w:firstColumn="1" w:firstRow="1" w:lastColumn="0" w:lastRow="0" w:noHBand="0" w:noVBand="1" w:val="04A0"/>
       </w:tblPr>
       <w:tblGrid>
@@ -988,23 +1581,23 @@
         <w:tc>
           <w:tcPr>
             <w:tcW w:type="dxa" w:w="9360"/>
-            <w:shd w:fill="F8FAFC"/>
+            <w:shd w:fill="F1F5F9"/>
+            <w:tcBorders>
+              <w:top w:val="single" w:sz="4" w:color="CBD5E1"/>
+              <w:left w:val="single" w:sz="18" w:color="1D4ED8"/>
+              <w:bottom w:val="single" w:sz="4" w:color="CBD5E1"/>
+              <w:right w:val="single" w:sz="4" w:color="CBD5E1"/>
+            </w:tcBorders>
             <w:tcMar>
               <w:top w:w="100" w:type="dxa"/>
               <w:bottom w:w="100" w:type="dxa"/>
-              <w:left w:w="150" w:type="dxa"/>
-              <w:right w:w="150" w:type="dxa"/>
+              <w:left w:w="160" w:type="dxa"/>
+              <w:right w:w="160" w:type="dxa"/>
             </w:tcMar>
-            <w:tcBorders>
-              <w:top w:val="single" w:sz="4" w:space="0" w:color="CBD5E1"/>
-              <w:left w:val="single" w:sz="18" w:space="0" w:color="1D4ED8"/>
-              <w:bottom w:val="single" w:sz="4" w:space="0" w:color="CBD5E1"/>
-              <w:right w:val="single" w:sz="4" w:space="0" w:color="CBD5E1"/>
-            </w:tcBorders>
           </w:tcPr>
           <w:p>
             <w:pPr>
-              <w:spacing w:before="40" w:after="40" w:line="276" w:lineRule="auto"/>
+              <w:spacing w:line="276" w:lineRule="auto"/>
             </w:pPr>
             <w:r>
               <w:rPr>
@@ -1013,122 +1606,333 @@
                 <w:sz w:val="17"/>
               </w:rPr>
               <w:br/>
-              <w:t>--- RUNNING DEMO SIMULATION ---</w:t>
-              <w:br/>
-              <w:br/>
-              <w:t>=== ENTRY PASS ISSUED ===</w:t>
-              <w:br/>
-              <w:t xml:space="preserve"> Ticket #1001 | Plate: KA-01-1234 | 4-Wheeler | Floor: 1 | Slot: #07</w:t>
-              <w:br/>
-              <w:br/>
-              <w:t>=== ENTRY PASS ISSUED ===</w:t>
-              <w:br/>
-              <w:t xml:space="preserve"> Ticket #1002 | Plate: DL-02-5678 | 2-Wheeler | Floor: 1 | Slot: #01</w:t>
-              <w:br/>
-              <w:br/>
-              <w:t>=== ENTRY PASS ISSUED ===</w:t>
-              <w:br/>
-              <w:t xml:space="preserve"> Ticket #1003 | Plate: MH-03-9999 | 4-Wheeler | Floor: 1 | Slot: #08</w:t>
-              <w:br/>
-              <w:br/>
-              <w:t>=== ENTRY PASS ISSUED ===</w:t>
-              <w:br/>
-              <w:t xml:space="preserve"> Ticket #1004 | Plate: 2W-TEST-01 | 2-Wheeler | Floor: 1 | Slot: #02</w:t>
-              <w:br/>
-              <w:br/>
-              <w:t>=== ENTRY PASS ISSUED ===</w:t>
-              <w:br/>
-              <w:t xml:space="preserve"> Ticket #1005 | Plate: 2W-TEST-02 | 2-Wheeler | Floor: 1 | Slot: #03</w:t>
-              <w:br/>
-              <w:br/>
-              <w:t>=== ENTRY PASS ISSUED ===</w:t>
-              <w:br/>
-              <w:t xml:space="preserve"> Ticket #1006 | Plate: 2W-TEST-03 | 2-Wheeler | Floor: 1 | Slot: #04</w:t>
-              <w:br/>
-              <w:br/>
-              <w:t>=== ENTRY PASS ISSUED ===</w:t>
-              <w:br/>
-              <w:t xml:space="preserve"> Ticket #1007 | Plate: 2W-TEST-04 | 2-Wheeler | Floor: 1 | Slot: #05</w:t>
-              <w:br/>
-              <w:br/>
-              <w:t>=== ENTRY PASS ISSUED ===</w:t>
-              <w:br/>
-              <w:t xml:space="preserve"> Ticket #1008 | Plate: 2W-TEST-05 | 2-Wheeler | Floor: 1 | Slot: #06</w:t>
-              <w:br/>
-              <w:t xml:space="preserve">   [!] Lot Full! Vehicle '2W-TEST-06' entered Waiting Queue (Position #1)</w:t>
-              <w:br/>
-              <w:br/>
-              <w:t>--- REAL-TIME PARKING LOT GRID ---</w:t>
-              <w:br/>
-              <w:t xml:space="preserve">Floor 1: [01: X] [02: X] [03: X] [04: X] [05: X] [06: X] [07: X] [08: X] [09: V] [10: V] </w:t>
-              <w:br/>
-              <w:t xml:space="preserve">Floor 2: [11: V] [12: V] [13: V] [14: V] [15: V] [16: V] [17: V] [18: V] [19: V] [20: V] </w:t>
-              <w:br/>
-              <w:t>Legend: [V] = Vacant | [X] = Occupied</w:t>
-              <w:br/>
-              <w:br/>
-              <w:t>--&gt; Searching slot for 'DL-02-5678' (Linear Search)...</w:t>
-              <w:br/>
-              <w:t xml:space="preserve">   Found at Slot #01</w:t>
-              <w:br/>
-              <w:br/>
-              <w:t>--&gt; Vehicle Exit &amp; Queue Auto-Allocation...</w:t>
-              <w:br/>
-              <w:br/>
-              <w:t>**************** BILL RECEIPT ****************</w:t>
-              <w:br/>
-              <w:t xml:space="preserve"> Ticket #1002 | Vehicle: DL-02-5678 (2-Wheeler)</w:t>
-              <w:br/>
-              <w:t xml:space="preserve"> Duration: 1.0 hrs | Rate: $15.00/hr | AI Surge: 1.50x</w:t>
-              <w:br/>
-              <w:t xml:space="preserve"> TOTAL CHARGE PAID: $22.50</w:t>
-              <w:br/>
-              <w:t>**********************************************</w:t>
-              <w:br/>
-              <w:t xml:space="preserve">   [+] Slot #01 is now free.</w:t>
-              <w:br/>
-              <w:t xml:space="preserve">   &gt;&gt;&gt; [AUTO-ALLOCATION]: Dequeued '2W-TEST-06' and assigned to freed Slot #01! &lt;&lt;&lt;</w:t>
-              <w:br/>
-              <w:br/>
-              <w:t>=== AI 24-HOUR DEMAND FORECAST &amp; DYNAMIC PRICING ===</w:t>
-              <w:br/>
-              <w:t>Hour  | Demand | Load Visualization      | Tariff Tier</w:t>
-              <w:br/>
-              <w:t>------+--------+-------------------------+--------------</w:t>
-              <w:br/>
-              <w:t>00:00 |  15.0% | ###                  | OFF-PEAK   (0.85x)</w:t>
-              <w:br/>
-              <w:t>02:00 |  15.0% | ###                  | OFF-PEAK   (0.85x)</w:t>
-              <w:br/>
-              <w:t>04:00 |  15.0% | ###                  | OFF-PEAK   (0.85x)</w:t>
-              <w:br/>
-              <w:t>06:00 |  40.0% | ########             | STANDARD   (1.0x)</w:t>
-              <w:br/>
-              <w:t>08:00 |  90.0% | ##################   | HIGH SURGE (1.5x)</w:t>
-              <w:br/>
-              <w:t>10:00 |  90.0% | ##################   | HIGH SURGE (1.5x)</w:t>
-              <w:br/>
-              <w:t>12:00 |  72.0% | ##############       | MODERATE   (1.25x)</w:t>
-              <w:br/>
-              <w:t>14:00 |  72.0% | ##############       | MODERATE   (1.25x)</w:t>
-              <w:br/>
-              <w:t>16:00 |  72.0% | ##############       | MODERATE   (1.25x)</w:t>
-              <w:br/>
-              <w:t>18:00 |  94.0% | ##################   | HIGH SURGE (1.5x)</w:t>
-              <w:br/>
-              <w:t>20:00 |  15.0% | ###                  | OFF-PEAK   (0.85x)</w:t>
-              <w:br/>
-              <w:t>22:00 |  15.0% | ###                  | OFF-PEAK   (0.85x)</w:t>
-              <w:br/>
-              <w:br/>
-              <w:t>=== PARKING STATISTICS ===</w:t>
-              <w:br/>
-              <w:t xml:space="preserve"> Capacity: 20 slots | Occupied: 8 (40.0%) | Available: 12</w:t>
-              <w:br/>
-              <w:t xml:space="preserve"> Waiting Queue: 0 vehicles | Completed Exits: 1 | Revenue: $22.50</w:t>
-              <w:br/>
-              <w:br/>
-              <w:t>--- DEMO COMPLETED ---</w:t>
+              <w:t>======================================================</w:t>
+              <w:br/>
+              <w:t xml:space="preserve">   BayTrack â€” Full-System Demonstration Session       </w:t>
+              <w:br/>
+              <w:t>======================================================</w:t>
+              <w:br/>
+              <w:br/>
+              <w:br/>
+              <w:t xml:space="preserve">  +-- ENTRY PASS GENERATED ---------------------------------+</w:t>
+              <w:br/>
+              <w:t xml:space="preserve">  | Pass   : #5001</w:t>
+              <w:br/>
+              <w:t xml:space="preserve">  | Vehicle: KA-05-MJ-7823    Driver : Ramesh Iyer          |</w:t>
+              <w:br/>
+              <w:t xml:space="preserve">  | Type   : Four-Wheeler     Bay #07  Level 0               |</w:t>
+              <w:br/>
+              <w:t xml:space="preserve">  | Arrived: 25-Oct 14:48                                     |</w:t>
+              <w:br/>
+              <w:t xml:space="preserve">  | Rate   : Rs.50/hr                                    |</w:t>
+              <w:br/>
+              <w:t xml:space="preserve">  +---------------------------------------------------------+</w:t>
+              <w:br/>
+              <w:br/>
+              <w:t xml:space="preserve">  +-- ENTRY PASS GENERATED ---------------------------------+</w:t>
+              <w:br/>
+              <w:t xml:space="preserve">  | Pass   : #5002</w:t>
+              <w:br/>
+              <w:t xml:space="preserve">  | Vehicle: TN-09-AB-3341    Driver : Meena Suresh         |</w:t>
+              <w:br/>
+              <w:t xml:space="preserve">  | Type   : Two-Wheeler      Bay #01  Level 0               |</w:t>
+              <w:br/>
+              <w:t xml:space="preserve">  | Arrived: 25-Oct 15:18                                     |</w:t>
+              <w:br/>
+              <w:t xml:space="preserve">  | Rate   : Rs.20/hr                                    |</w:t>
+              <w:br/>
+              <w:t xml:space="preserve">  +---------------------------------------------------------+</w:t>
+              <w:br/>
+              <w:br/>
+              <w:t xml:space="preserve">  +-- ENTRY PASS GENERATED ---------------------------------+</w:t>
+              <w:br/>
+              <w:t xml:space="preserve">  | Pass   : #5003</w:t>
+              <w:br/>
+              <w:t xml:space="preserve">  | Vehicle: MH-14-CD-6610    Driver : Arjun Patil          |</w:t>
+              <w:br/>
+              <w:t xml:space="preserve">  | Type   : Four-Wheeler     Bay #08  Level 0               |</w:t>
+              <w:br/>
+              <w:t xml:space="preserve">  | Arrived: 25-Oct 15:48                                     |</w:t>
+              <w:br/>
+              <w:t xml:space="preserve">  | Rate   : Rs.50/hr                                    |</w:t>
+              <w:br/>
+              <w:t xml:space="preserve">  +---------------------------------------------------------+</w:t>
+              <w:br/>
+              <w:br/>
+              <w:t xml:space="preserve">  +-- ENTRY PASS GENERATED ---------------------------------+</w:t>
+              <w:br/>
+              <w:t xml:space="preserve">  | Pass   : #5004</w:t>
+              <w:br/>
+              <w:t xml:space="preserve">  | Vehicle: AP-28-EF-1120    Driver : Divya Reddy          |</w:t>
+              <w:br/>
+              <w:t xml:space="preserve">  | Type   : Two-Wheeler      Bay #02  Level 0               |</w:t>
+              <w:br/>
+              <w:t xml:space="preserve">  | Arrived: 25-Oct 15:58                                     |</w:t>
+              <w:br/>
+              <w:t xml:space="preserve">  | Rate   : Rs.20/hr                                    |</w:t>
+              <w:br/>
+              <w:t xml:space="preserve">  +---------------------------------------------------------+</w:t>
+              <w:br/>
+              <w:br/>
+              <w:t xml:space="preserve">  +-- ENTRY PASS GENERATED ---------------------------------+</w:t>
+              <w:br/>
+              <w:t xml:space="preserve">  | Pass   : #5005</w:t>
+              <w:br/>
+              <w:t xml:space="preserve">  | Vehicle: DL-01-GH-9902    Driver : Priya Mehta          |</w:t>
+              <w:br/>
+              <w:t xml:space="preserve">  | Type   : Four-Wheeler     Bay #09  Level 0               |</w:t>
+              <w:br/>
+              <w:t xml:space="preserve">  | Arrived: 25-Oct 16:18                                     |</w:t>
+              <w:br/>
+              <w:t xml:space="preserve">  | Rate   : Rs.50/hr                                    |</w:t>
+              <w:br/>
+              <w:t xml:space="preserve">  +---------------------------------------------------------+</w:t>
+              <w:br/>
+              <w:br/>
+              <w:t xml:space="preserve">  +-- ENTRY PASS GENERATED ---------------------------------+</w:t>
+              <w:br/>
+              <w:t xml:space="preserve">  | Pass   : #5006</w:t>
+              <w:br/>
+              <w:t xml:space="preserve">  | Vehicle: KL-07-JK-4456    Driver : Suresh Nair          |</w:t>
+              <w:br/>
+              <w:t xml:space="preserve">  | Type   : Two-Wheeler      Bay #03  Level 0               |</w:t>
+              <w:br/>
+              <w:t xml:space="preserve">  | Arrived: 25-Oct 16:28                                     |</w:t>
+              <w:br/>
+              <w:t xml:space="preserve">  | Rate   : Rs.20/hr                                    |</w:t>
+              <w:br/>
+              <w:t xml:space="preserve">  +---------------------------------------------------------+</w:t>
+              <w:br/>
+              <w:br/>
+              <w:t xml:space="preserve">  +-- ENTRY PASS GENERATED ---------------------------------+</w:t>
+              <w:br/>
+              <w:t xml:space="preserve">  | Pass   : #5007</w:t>
+              <w:br/>
+              <w:t xml:space="preserve">  | Vehicle: TS-11-AA-0001    Driver : Ravi Kumar           |</w:t>
+              <w:br/>
+              <w:t xml:space="preserve">  | Type   : Two-Wheeler      Bay #04  Level 0               |</w:t>
+              <w:br/>
+              <w:t xml:space="preserve">  | Arrived: 25-Oct 16:48                                     |</w:t>
+              <w:br/>
+              <w:t xml:space="preserve">  | Rate   : Rs.20/hr                                    |</w:t>
+              <w:br/>
+              <w:t xml:space="preserve">  +---------------------------------------------------------+</w:t>
+              <w:br/>
+              <w:br/>
+              <w:t xml:space="preserve">  +-- ENTRY PASS GENERATED ---------------------------------+</w:t>
+              <w:br/>
+              <w:t xml:space="preserve">  | Pass   : #5008</w:t>
+              <w:br/>
+              <w:t xml:space="preserve">  | Vehicle: GJ-06-BB-0002    Driver : Neha Shah            |</w:t>
+              <w:br/>
+              <w:t xml:space="preserve">  | Type   : Two-Wheeler      Bay #05  Level 0               |</w:t>
+              <w:br/>
+              <w:t xml:space="preserve">  | Arrived: 25-Oct 16:58                                     |</w:t>
+              <w:br/>
+              <w:t xml:space="preserve">  | Rate   : Rs.20/hr                                    |</w:t>
+              <w:br/>
+              <w:t xml:space="preserve">  +---------------------------------------------------------+</w:t>
+              <w:br/>
+              <w:br/>
+              <w:t xml:space="preserve">  +-- ENTRY PASS GENERATED ---------------------------------+</w:t>
+              <w:br/>
+              <w:t xml:space="preserve">  | Pass   : #5009</w:t>
+              <w:br/>
+              <w:t xml:space="preserve">  | Vehicle: RJ-14-CC-0003    Driver : Anil Joshi           |</w:t>
+              <w:br/>
+              <w:t xml:space="preserve">  | Type   : Two-Wheeler      Bay #06  Level 0               |</w:t>
+              <w:br/>
+              <w:t xml:space="preserve">  | Arrived: 25-Oct 17:03                                     |</w:t>
+              <w:br/>
+              <w:t xml:space="preserve">  | Rate   : Rs.20/hr                                    |</w:t>
+              <w:br/>
+              <w:t xml:space="preserve">  +---------------------------------------------------------+</w:t>
+              <w:br/>
+              <w:t xml:space="preserve">  [QUEUE] 'UP-32-DD-0004' entered hold-line at position #1.</w:t>
+              <w:br/>
+              <w:br/>
+              <w:t>--- Bay Layout after initial arrivals ---</w:t>
+              <w:br/>
+              <w:br/>
+              <w:t xml:space="preserve">  +-- Bay Layout Map ----------------------------------------+</w:t>
+              <w:br/>
+              <w:t xml:space="preserve">  | Level 0: [01:XX] [02:XX] [03:XX] [04:XX] [05:XX] [06:XX] [07:XX] [08:XX] [09:XX] [10:--] |</w:t>
+              <w:br/>
+              <w:t xml:space="preserve">  | Level 1: [11:--] [12:--] [13:--] [14:--] [15:--] [16:--] [17:--] [18:--] [19:--] [20:--] |</w:t>
+              <w:br/>
+              <w:t xml:space="preserve">  | Key: [--] = Vacant   [XX] = Occupied                   |</w:t>
+              <w:br/>
+              <w:t xml:space="preserve">  +---------------------------------------------------------+</w:t>
+              <w:br/>
+              <w:br/>
+              <w:br/>
+              <w:t xml:space="preserve">  +-- Hold-Line (FIFO Queue) --------------------------------+</w:t>
+              <w:br/>
+              <w:t xml:space="preserve">  | #1  UP-32-DD-0004    Two-Wheeler                      |</w:t>
+              <w:br/>
+              <w:t xml:space="preserve">  +---------------------------------------------------------+</w:t>
+              <w:br/>
+              <w:br/>
+              <w:t xml:space="preserve">  [LINEAR SEARCH] Locating 'MH-14-CD-6610'...</w:t>
+              <w:br/>
+              <w:t xml:space="preserve">  [RESULT] Found in Bay #08.</w:t>
+              <w:br/>
+              <w:br/>
+              <w:t xml:space="preserve">  [EXIT] TN-09-AB-3341 departing...</w:t>
+              <w:br/>
+              <w:br/>
+              <w:t xml:space="preserve">  +============== PAYMENT RECEIPT ==========================+</w:t>
+              <w:br/>
+              <w:t xml:space="preserve">  | Pass #5002     Vehicle : TN-09-AB-3341                |</w:t>
+              <w:br/>
+              <w:t xml:space="preserve">  | Type  : Two-Wheeler                              |</w:t>
+              <w:br/>
+              <w:t xml:space="preserve">  | Bay   : #01   Arrived : 25-Oct 15:18                |</w:t>
+              <w:br/>
+              <w:t xml:space="preserve">  | Depart: 25-Oct 17:18                             |</w:t>
+              <w:br/>
+              <w:t xml:space="preserve">  | Hours : 2.0 hrs   Rate : Rs.20/hr                   |</w:t>
+              <w:br/>
+              <w:t xml:space="preserve">  | PeakScore: 1.00   Price-Mult: x1.60                    |</w:t>
+              <w:br/>
+              <w:t xml:space="preserve">  |---------------------------------------------------------|</w:t>
+              <w:br/>
+              <w:t xml:space="preserve">  | AMOUNT DUE : Rs. 64.00                                |</w:t>
+              <w:br/>
+              <w:t xml:space="preserve">  +=========================================================+</w:t>
+              <w:br/>
+              <w:t xml:space="preserve">  [BAY] Bay #01 is now free.</w:t>
+              <w:br/>
+              <w:t xml:space="preserve">  [AUTO] 'UP-32-DD-0004' moved from queue to Bay #01.</w:t>
+              <w:br/>
+              <w:br/>
+              <w:t xml:space="preserve">  [EXIT] KA-05-MJ-7823 departing...</w:t>
+              <w:br/>
+              <w:br/>
+              <w:t xml:space="preserve">  +============== PAYMENT RECEIPT ==========================+</w:t>
+              <w:br/>
+              <w:t xml:space="preserve">  | Pass #5001     Vehicle : KA-05-MJ-7823                |</w:t>
+              <w:br/>
+              <w:t xml:space="preserve">  | Type  : Four-Wheeler                             |</w:t>
+              <w:br/>
+              <w:t xml:space="preserve">  | Bay   : #07   Arrived : 25-Oct 14:48                |</w:t>
+              <w:br/>
+              <w:t xml:space="preserve">  | Depart: 25-Oct 17:18                             |</w:t>
+              <w:br/>
+              <w:t xml:space="preserve">  | Hours : 2.5 hrs   Rate : Rs.50/hr                   |</w:t>
+              <w:br/>
+              <w:t xml:space="preserve">  | PeakScore: 1.00   Price-Mult: x1.60                    |</w:t>
+              <w:br/>
+              <w:t xml:space="preserve">  |---------------------------------------------------------|</w:t>
+              <w:br/>
+              <w:t xml:space="preserve">  | AMOUNT DUE : Rs. 200.00                                |</w:t>
+              <w:br/>
+              <w:t xml:space="preserve">  +=========================================================+</w:t>
+              <w:br/>
+              <w:t xml:space="preserve">  [BAY] Bay #07 is now free.</w:t>
+              <w:br/>
+              <w:br/>
+              <w:t xml:space="preserve">  +-- Sessions Ranked by Fee Collected (High -&gt; Low) ------+</w:t>
+              <w:br/>
+              <w:t xml:space="preserve">  | Rank | Pass   | Vehicle        | Hrs   | Fee (Rs)  |</w:t>
+              <w:br/>
+              <w:t xml:space="preserve">  |------+--------+----------------+-------+-----------|</w:t>
+              <w:br/>
+              <w:t xml:space="preserve">  |    1 | #5001  | KA-05-MJ-7823  |   2.5 |    200.00 |</w:t>
+              <w:br/>
+              <w:t xml:space="preserve">  |    2 | #5002  | TN-09-AB-3341  |   2.0 |     64.00 |</w:t>
+              <w:br/>
+              <w:t xml:space="preserve">  +--------------------------------------------------------+</w:t>
+              <w:br/>
+              <w:br/>
+              <w:t xml:space="preserve">  [BINARY SEARCH] Looking up Pass #5001...</w:t>
+              <w:br/>
+              <w:t xml:space="preserve">  [FOUND] Pass #5001 -&gt; KA-05-MJ-7823 | Bay #7 | Rs.200.00</w:t>
+              <w:br/>
+              <w:br/>
+              <w:t xml:space="preserve">  [AI FORECAST] 24-Hour Occupancy &amp; Tariff Schedule:</w:t>
+              <w:br/>
+              <w:br/>
+              <w:t>+------+-------+------------------------+--------------------+</w:t>
+              <w:br/>
+              <w:t>| Hour | Score | Bar (each | = 5%)      | Tariff Tier        |</w:t>
+              <w:br/>
+              <w:t>+------+-------+------------------------+--------------------+</w:t>
+              <w:br/>
+              <w:t>| 00:00| 0.00  |                        | OFF-PEAK    x0.80  |</w:t>
+              <w:br/>
+              <w:t>| 01:00| 0.00  |                        | OFF-PEAK    x0.80  |</w:t>
+              <w:br/>
+              <w:t>| 02:00| 0.00  |                        | OFF-PEAK    x0.80  |</w:t>
+              <w:br/>
+              <w:t>| 03:00| 0.00  |                        | OFF-PEAK    x0.80  |</w:t>
+              <w:br/>
+              <w:t>| 04:00| 0.00  |                        | OFF-PEAK    x0.80  |</w:t>
+              <w:br/>
+              <w:t>| 05:00| 0.01  |                        | OFF-PEAK    x0.80  |</w:t>
+              <w:br/>
+              <w:t>| 06:00| 0.09  | |                      | OFF-PEAK    x0.80  |</w:t>
+              <w:br/>
+              <w:t>| 07:00| 0.31  | ||||||                 | NORMAL      x1.00  |</w:t>
+              <w:br/>
+              <w:t>| 08:00| 0.66  | |||||||||||||          | MODERATE    x1.25  |</w:t>
+              <w:br/>
+              <w:t>| 09:00| 0.85  | |||||||||||||||||      | PEAK SURGE  x1.60  |</w:t>
+              <w:br/>
+              <w:t>| 10:00| 1.00  | ||||||||||||||||||||   | PEAK SURGE  x1.60  |</w:t>
+              <w:br/>
+              <w:t>| 11:00| 0.93  | ||||||||||||||||||     | PEAK SURGE  x1.60  |</w:t>
+              <w:br/>
+              <w:t>| 12:00| 0.71  | ||||||||||||||         | MODERATE    x1.25  |</w:t>
+              <w:br/>
+              <w:t>| 13:00| 0.63  | ||||||||||||           | MODERATE    x1.25  |</w:t>
+              <w:br/>
+              <w:t>| 14:00| 0.62  | ||||||||||||           | MODERATE    x1.25  |</w:t>
+              <w:br/>
+              <w:t>| 15:00| 0.65  | ||||||||||||           | MODERATE    x1.25  |</w:t>
+              <w:br/>
+              <w:t>| 16:00| 0.77  | |||||||||||||||        | MODERATE    x1.25  |</w:t>
+              <w:br/>
+              <w:t>| 17:00| 1.00  | ||||||||||||||||||||   | PEAK SURGE  x1.60  |</w:t>
+              <w:br/>
+              <w:t>| 18:00| 0.87  | |||||||||||||||||      | PEAK SURGE  x1.60  |</w:t>
+              <w:br/>
+              <w:t>| 19:00| 0.87  | |||||||||||||||||      | PEAK SURGE  x1.60  |</w:t>
+              <w:br/>
+              <w:t>| 20:00| 0.48  | |||||||||              | NORMAL      x1.00  |</w:t>
+              <w:br/>
+              <w:t>| 21:00| 0.15  | ||                     | OFF-PEAK    x0.80  |</w:t>
+              <w:br/>
+              <w:t>| 22:00| 0.03  |                        | OFF-PEAK    x0.80  |</w:t>
+              <w:br/>
+              <w:t>| 23:00| 0.00  |                        | OFF-PEAK    x0.80  |</w:t>
+              <w:br/>
+              <w:t>+------+-------+------------------------+--------------------+</w:t>
+              <w:br/>
+              <w:br/>
+              <w:br/>
+              <w:t xml:space="preserve">  +-- Facility Summary -------------------------------------+</w:t>
+              <w:br/>
+              <w:t xml:space="preserve">  | Total Bays      : 20                                    |</w:t>
+              <w:br/>
+              <w:t xml:space="preserve">  | Occupied        : 8                                    |</w:t>
+              <w:br/>
+              <w:t xml:space="preserve">  | Available       : 12                                    |</w:t>
+              <w:br/>
+              <w:t xml:space="preserve">  | Hold Queue Size : 0                                    |</w:t>
+              <w:br/>
+              <w:t xml:space="preserve">  | Sessions Closed : 2                                    |</w:t>
+              <w:br/>
+              <w:t xml:space="preserve">  | Total Revenue   : Rs. 264.00                           |</w:t>
+              <w:br/>
+              <w:t xml:space="preserve">  +---------------------------------------------------------+</w:t>
+              <w:br/>
+              <w:br/>
+              <w:t>======================================================</w:t>
+              <w:br/>
+              <w:t xml:space="preserve">                 Demo Complete.                       </w:t>
+              <w:br/>
+              <w:t>======================================================</w:t>
               <w:br/>
               <w:br/>
             </w:r>
@@ -1138,7 +1942,7 @@
     </w:tbl>
     <w:p>
       <w:pPr>
-        <w:spacing w:before="40" w:after="120"/>
+        <w:spacing w:after="160"/>
       </w:pPr>
     </w:p>
     <w:sectPr>

</xml_diff>